<commit_message>
Rework Blog 3 into a named-platform listicle
Rebuild the SaaS roundup to actually name and profile the companies, as the
title and search intent demand: a comparison table of 13 verified platforms
plus per-category detail (GoHighLevel, Vendasta, Duda, Simvoly, SE Ranking,
AgencyAnalytics, Sendible, SocialPilot; and in voice AI Trillet, Synthflow,
Autocalls, VoiceAIWrapper, Stammer). All competitor pricing/white-label/
compliance facts verified Sep 2026; Trillet featured in voice with a
disclosure and reconciled figures. Zero em-dashes.

Co-Authored-By: Claude Opus 4.8 <noreply@anthropic.com>
Claude-Session: https://claude.ai/code/session_01UhVChLeNNjFDr6eASTMGhh
</commit_message>
<xml_diff>
--- a/seo-audit/Article-03-White-Label-SaaS-Platforms.docx
+++ b/seo-audit/Article-03-White-Label-SaaS-Platforms.docx
@@ -113,7 +113,7 @@
           <w:sz w:val="14"/>
           <w:szCs w:val="14"/>
         </w:rPr>
-        <w:t xml:space="preserve">The white-label SaaS worth reselling in 2026, by category: what carries the margin, what keeps clients, and where voice AI fits for regulated work.  (147)</w:t>
+        <w:t xml:space="preserve">The best white-label SaaS platforms to resell in 2026, named and compared by category, with an honest note on margin, stickiness and compliance.  (144)</w:t>
       </w:r>
     </w:p>
     <w:p>
@@ -167,7 +167,7 @@
           <w:sz w:val="17"/>
           <w:szCs w:val="17"/>
         </w:rPr>
-        <w:t xml:space="preserve">white label saas platforms · white label software to resell · best white label saas · resell saas under your brand · white label saas for agencies · recurring revenue · agency margin · sticky software</w:t>
+        <w:t xml:space="preserve">white label saas platforms · white label software to resell · best white label saas · resell saas under your brand · white label saas for agencies · white label saas companies · recurring revenue · agency margin</w:t>
       </w:r>
     </w:p>
     <w:p>
@@ -194,7 +194,7 @@
           <w:sz w:val="17"/>
           <w:szCs w:val="17"/>
         </w:rPr>
-        <w:t xml:space="preserve">Top-of-funnel discovery. Broad reach; routes voice-intent readers to /whitelabel. Trillet is the featured pick in the voice-AI category.</w:t>
+        <w:t xml:space="preserve">Top-of-funnel discovery. Broad reach; routes voice-intent readers to /whitelabel. Trillet is the featured pick in the voice-AI category (disclosed).</w:t>
       </w:r>
     </w:p>
     <w:p>
@@ -226,6 +226,33 @@
     </w:p>
     <w:p>
       <w:pPr>
+        <w:spacing w:after="26"/>
+      </w:pPr>
+      <w:r>
+        <w:rPr>
+          <w:rFonts w:ascii="Consolas" w:cs="Consolas" w:eastAsia="Consolas" w:hAnsi="Consolas"/>
+          <w:b/>
+          <w:bCs/>
+          <w:color w:val="9A6B3F"/>
+          <w:sz w:val="14"/>
+          <w:szCs w:val="14"/>
+        </w:rPr>
+        <w:t xml:space="preserve">FACT-CHECK   </w:t>
+      </w:r>
+      <w:r>
+        <w:rPr>
+          <w:rFonts w:ascii="Calibri" w:cs="Calibri" w:eastAsia="Calibri" w:hAnsi="Calibri"/>
+          <w:b w:val="false"/>
+          <w:bCs w:val="false"/>
+          <w:color w:val="24303F"/>
+          <w:sz w:val="17"/>
+          <w:szCs w:val="17"/>
+        </w:rPr>
+        <w:t xml:space="preserve">Competitor pricing/white-label facts verified Sep 2026 (GoHighLevel, Vendasta, Duda, Simvoly, SE Ranking, AgencyAnalytics, Sendible, SocialPilot, Synthflow, Autocalls, VoiceAIWrapper, Stammer). Re-verify before publish; vendors change terms.</w:t>
+      </w:r>
+    </w:p>
+    <w:p>
+      <w:pPr>
         <w:pBdr>
           <w:bottom w:val="single" w:color="D9DEE8" w:sz="6"/>
         </w:pBdr>
@@ -250,7 +277,7 @@
           <w:sz w:val="20"/>
           <w:szCs w:val="20"/>
         </w:rPr>
-        <w:t xml:space="preserve">I have made money reselling other people's software, and I have lost it too. Before I built Trillet I ran an agency, and white-label SaaS was how we turned one-off projects into something that paid us every month. The trick was never finding software to rebrand, there is plenty. The trick was picking the few tools that carried a real margin, that clients would not cancel, and that would not embarrass us when something went wrong. This is the white-label SaaS I would actually resell in 2026, sorted by category, with an honest note on where each one earns its keep.</w:t>
+        <w:t xml:space="preserve">I have made money reselling other people's software, and I have lost it too. Before I built Trillet I ran an agency, and white-label SaaS was how we turned one-off projects into something that paid us every month. The trick was never finding software to rebrand, there is plenty. The trick was picking the few platforms that carried a real margin, that clients would not cancel, and that would not embarrass us when something went wrong. Below are the white-label SaaS platforms I would actually resell in 2026, named and sorted by category, with an honest note on where each one earns its keep.</w:t>
       </w:r>
     </w:p>
     <w:tbl>
@@ -308,7 +335,7 @@
                 <w:sz w:val="20"/>
                 <w:szCs w:val="20"/>
               </w:rPr>
-              <w:t xml:space="preserve">White-label SaaS is software you resell under your own brand: you pay a wholesale rate, put your name on it, set your price, and keep the client. The categories worth reselling in 2026 are all-in-one agency suites (GoHighLevel, Vendasta), website and funnel builders, SEO and reporting tools, email and automation, review and social management, and voice AI. Voice AI is the newest and the stickiest, because a missed call is money a client can feel; for regulated clients, pick a voice platform with compliance and a call record built in, like Trillet.</w:t>
+              <w:t xml:space="preserve">White-label SaaS is software you resell under your own brand. The platforms worth reselling in 2026, by category: all-in-one suites (GoHighLevel, Vendasta), website and funnel builders (Duda, Simvoly), SEO and reporting (SE Ranking, AgencyAnalytics), social and review management (Sendible, SocialPilot), and voice AI (Trillet, Synthflow, Autocalls). Voice AI is the newest and the stickiest, because a missed call is money a client feels the same day; for regulated clients, pick a voice platform with compliance and a call record built in, like Trillet.</w:t>
             </w:r>
           </w:p>
         </w:tc>
@@ -557,7 +584,7 @@
           <w:sz w:val="25"/>
           <w:szCs w:val="25"/>
         </w:rPr>
-        <w:t xml:space="preserve">The white-label SaaS worth reselling in 2026, by category</w:t>
+        <w:t xml:space="preserve">The white-label SaaS platforms worth reselling in 2026</w:t>
       </w:r>
     </w:p>
     <w:p>
@@ -575,7 +602,7 @@
           <w:sz w:val="20"/>
           <w:szCs w:val="20"/>
         </w:rPr>
-        <w:t xml:space="preserve">None of these is best for every agency. The right mix follows the clients you already have. Here is how the main categories stack up, then a closer look at the two that matter most for margin and retention.</w:t>
+        <w:t xml:space="preserve">Here are the platforms I would shortlist, by category, with what you actually rebrand and who each one suits. Prices and terms move, so treat the figures as the shape of the market and confirm the current numbers before you commit.</w:t>
       </w:r>
     </w:p>
     <w:tbl>
@@ -591,10 +618,10 @@
         </w:tblBorders>
       </w:tblPr>
       <w:tblGrid>
+        <w:gridCol w:w="1550"/>
         <w:gridCol w:w="1750"/>
-        <w:gridCol w:w="2500"/>
-        <w:gridCol w:w="2600"/>
-        <w:gridCol w:w="2510"/>
+        <w:gridCol w:w="2260"/>
+        <w:gridCol w:w="3800"/>
       </w:tblGrid>
       <w:tr>
         <w:trPr>
@@ -602,7 +629,7 @@
         </w:trPr>
         <w:tc>
           <w:tcPr>
-            <w:tcW w:type="dxa" w:w="1750"/>
+            <w:tcW w:type="dxa" w:w="1550"/>
             <w:tcBorders>
               <w:top w:val="single" w:color="D9DEE8" w:sz="4"/>
               <w:left w:val="single" w:color="D9DEE8" w:sz="4"/>
@@ -630,13 +657,13 @@
                 <w:sz w:val="14"/>
                 <w:szCs w:val="14"/>
               </w:rPr>
-              <w:t xml:space="preserve">Category</w:t>
-            </w:r>
-          </w:p>
-        </w:tc>
-        <w:tc>
-          <w:tcPr>
-            <w:tcW w:type="dxa" w:w="2500"/>
+              <w:t xml:space="preserve">Platform</w:t>
+            </w:r>
+          </w:p>
+        </w:tc>
+        <w:tc>
+          <w:tcPr>
+            <w:tcW w:type="dxa" w:w="1750"/>
             <w:tcBorders>
               <w:top w:val="single" w:color="D9DEE8" w:sz="4"/>
               <w:left w:val="single" w:color="D9DEE8" w:sz="4"/>
@@ -664,13 +691,13 @@
                 <w:sz w:val="14"/>
                 <w:szCs w:val="14"/>
               </w:rPr>
-              <w:t xml:space="preserve">What you rebrand</w:t>
-            </w:r>
-          </w:p>
-        </w:tc>
-        <w:tc>
-          <w:tcPr>
-            <w:tcW w:type="dxa" w:w="2600"/>
+              <w:t xml:space="preserve">Category</w:t>
+            </w:r>
+          </w:p>
+        </w:tc>
+        <w:tc>
+          <w:tcPr>
+            <w:tcW w:type="dxa" w:w="2260"/>
             <w:tcBorders>
               <w:top w:val="single" w:color="D9DEE8" w:sz="4"/>
               <w:left w:val="single" w:color="D9DEE8" w:sz="4"/>
@@ -698,13 +725,13 @@
                 <w:sz w:val="14"/>
                 <w:szCs w:val="14"/>
               </w:rPr>
-              <w:t xml:space="preserve">Margin &amp; stickiness</w:t>
-            </w:r>
-          </w:p>
-        </w:tc>
-        <w:tc>
-          <w:tcPr>
-            <w:tcW w:type="dxa" w:w="2510"/>
+              <w:t xml:space="preserve">White-label</w:t>
+            </w:r>
+          </w:p>
+        </w:tc>
+        <w:tc>
+          <w:tcPr>
+            <w:tcW w:type="dxa" w:w="3800"/>
             <w:tcBorders>
               <w:top w:val="single" w:color="D9DEE8" w:sz="4"/>
               <w:left w:val="single" w:color="D9DEE8" w:sz="4"/>
@@ -732,7 +759,7 @@
                 <w:sz w:val="14"/>
                 <w:szCs w:val="14"/>
               </w:rPr>
-              <w:t xml:space="preserve">Watch for</w:t>
+              <w:t xml:space="preserve">Best for</w:t>
             </w:r>
           </w:p>
         </w:tc>
@@ -740,6 +767,40 @@
       <w:tr>
         <w:tc>
           <w:tcPr>
+            <w:tcW w:type="dxa" w:w="1550"/>
+            <w:tcBorders>
+              <w:top w:val="single" w:color="D9DEE8" w:sz="4"/>
+              <w:left w:val="single" w:color="D9DEE8" w:sz="4"/>
+              <w:bottom w:val="single" w:color="D9DEE8" w:sz="4"/>
+              <w:right w:val="single" w:color="D9DEE8" w:sz="4"/>
+            </w:tcBorders>
+            <w:shd w:fill="FFFFFF" w:color="auto" w:val="clear"/>
+            <w:tcMar>
+              <w:top w:type="dxa" w:w="58"/>
+              <w:left w:type="dxa" w:w="90"/>
+              <w:bottom w:type="dxa" w:w="58"/>
+              <w:right w:type="dxa" w:w="90"/>
+            </w:tcMar>
+          </w:tcPr>
+          <w:p>
+            <w:pPr>
+              <w:spacing w:after="0" w:line="246"/>
+            </w:pPr>
+            <w:r>
+              <w:rPr>
+                <w:rFonts w:ascii="Calibri" w:cs="Calibri" w:eastAsia="Calibri" w:hAnsi="Calibri"/>
+                <w:b w:val="false"/>
+                <w:bCs w:val="false"/>
+                <w:color w:val="24303F"/>
+                <w:sz w:val="13"/>
+                <w:szCs w:val="13"/>
+              </w:rPr>
+              <w:t xml:space="preserve">GoHighLevel</w:t>
+            </w:r>
+          </w:p>
+        </w:tc>
+        <w:tc>
+          <w:tcPr>
             <w:tcW w:type="dxa" w:w="1750"/>
             <w:tcBorders>
               <w:top w:val="single" w:color="D9DEE8" w:sz="4"/>
@@ -768,109 +829,75 @@
                 <w:sz w:val="13"/>
                 <w:szCs w:val="13"/>
               </w:rPr>
-              <w:t xml:space="preserve">All-in-one agency suites</w:t>
-            </w:r>
-          </w:p>
-        </w:tc>
-        <w:tc>
-          <w:tcPr>
-            <w:tcW w:type="dxa" w:w="2500"/>
-            <w:tcBorders>
-              <w:top w:val="single" w:color="D9DEE8" w:sz="4"/>
-              <w:left w:val="single" w:color="D9DEE8" w:sz="4"/>
-              <w:bottom w:val="single" w:color="D9DEE8" w:sz="4"/>
-              <w:right w:val="single" w:color="D9DEE8" w:sz="4"/>
-            </w:tcBorders>
-            <w:shd w:fill="FFFFFF" w:color="auto" w:val="clear"/>
-            <w:tcMar>
-              <w:top w:type="dxa" w:w="58"/>
-              <w:left w:type="dxa" w:w="90"/>
-              <w:bottom w:type="dxa" w:w="58"/>
-              <w:right w:type="dxa" w:w="90"/>
-            </w:tcMar>
-          </w:tcPr>
-          <w:p>
-            <w:pPr>
-              <w:spacing w:after="0" w:line="246"/>
-            </w:pPr>
-            <w:r>
-              <w:rPr>
-                <w:rFonts w:ascii="Calibri" w:cs="Calibri" w:eastAsia="Calibri" w:hAnsi="Calibri"/>
-                <w:b w:val="false"/>
-                <w:bCs w:val="false"/>
-                <w:color w:val="24303F"/>
-                <w:sz w:val="13"/>
-                <w:szCs w:val="13"/>
-              </w:rPr>
-              <w:t xml:space="preserve">CRM, funnels, email, booking, some AI (GoHighLevel, Vendasta)</w:t>
-            </w:r>
-          </w:p>
-        </w:tc>
-        <w:tc>
-          <w:tcPr>
-            <w:tcW w:type="dxa" w:w="2600"/>
-            <w:tcBorders>
-              <w:top w:val="single" w:color="D9DEE8" w:sz="4"/>
-              <w:left w:val="single" w:color="D9DEE8" w:sz="4"/>
-              <w:bottom w:val="single" w:color="D9DEE8" w:sz="4"/>
-              <w:right w:val="single" w:color="D9DEE8" w:sz="4"/>
-            </w:tcBorders>
-            <w:shd w:fill="FFFFFF" w:color="auto" w:val="clear"/>
-            <w:tcMar>
-              <w:top w:type="dxa" w:w="58"/>
-              <w:left w:type="dxa" w:w="90"/>
-              <w:bottom w:type="dxa" w:w="58"/>
-              <w:right w:type="dxa" w:w="90"/>
-            </w:tcMar>
-          </w:tcPr>
-          <w:p>
-            <w:pPr>
-              <w:spacing w:after="0" w:line="246"/>
-            </w:pPr>
-            <w:r>
-              <w:rPr>
-                <w:rFonts w:ascii="Calibri" w:cs="Calibri" w:eastAsia="Calibri" w:hAnsi="Calibri"/>
-                <w:b w:val="false"/>
-                <w:bCs w:val="false"/>
-                <w:color w:val="24303F"/>
-                <w:sz w:val="13"/>
-                <w:szCs w:val="13"/>
-              </w:rPr>
-              <w:t xml:space="preserve">High stickiness once a client runs their business on it</w:t>
-            </w:r>
-          </w:p>
-        </w:tc>
-        <w:tc>
-          <w:tcPr>
-            <w:tcW w:type="dxa" w:w="2510"/>
-            <w:tcBorders>
-              <w:top w:val="single" w:color="D9DEE8" w:sz="4"/>
-              <w:left w:val="single" w:color="D9DEE8" w:sz="4"/>
-              <w:bottom w:val="single" w:color="D9DEE8" w:sz="4"/>
-              <w:right w:val="single" w:color="D9DEE8" w:sz="4"/>
-            </w:tcBorders>
-            <w:shd w:fill="FFFFFF" w:color="auto" w:val="clear"/>
-            <w:tcMar>
-              <w:top w:type="dxa" w:w="58"/>
-              <w:left w:type="dxa" w:w="90"/>
-              <w:bottom w:type="dxa" w:w="58"/>
-              <w:right w:type="dxa" w:w="90"/>
-            </w:tcMar>
-          </w:tcPr>
-          <w:p>
-            <w:pPr>
-              <w:spacing w:after="0" w:line="246"/>
-            </w:pPr>
-            <w:r>
-              <w:rPr>
-                <w:rFonts w:ascii="Calibri" w:cs="Calibri" w:eastAsia="Calibri" w:hAnsi="Calibri"/>
-                <w:b w:val="false"/>
-                <w:bCs w:val="false"/>
-                <w:color w:val="24303F"/>
-                <w:sz w:val="13"/>
-                <w:szCs w:val="13"/>
-              </w:rPr>
-              <w:t xml:space="preserve">Broad but shallow; you resell a whole platform, not a focused tool</w:t>
+              <w:t xml:space="preserve">All-in-one suite</w:t>
+            </w:r>
+          </w:p>
+        </w:tc>
+        <w:tc>
+          <w:tcPr>
+            <w:tcW w:type="dxa" w:w="2260"/>
+            <w:tcBorders>
+              <w:top w:val="single" w:color="D9DEE8" w:sz="4"/>
+              <w:left w:val="single" w:color="D9DEE8" w:sz="4"/>
+              <w:bottom w:val="single" w:color="D9DEE8" w:sz="4"/>
+              <w:right w:val="single" w:color="D9DEE8" w:sz="4"/>
+            </w:tcBorders>
+            <w:shd w:fill="FFFFFF" w:color="auto" w:val="clear"/>
+            <w:tcMar>
+              <w:top w:type="dxa" w:w="58"/>
+              <w:left w:type="dxa" w:w="90"/>
+              <w:bottom w:type="dxa" w:w="58"/>
+              <w:right w:type="dxa" w:w="90"/>
+            </w:tcMar>
+          </w:tcPr>
+          <w:p>
+            <w:pPr>
+              <w:spacing w:after="0" w:line="246"/>
+            </w:pPr>
+            <w:r>
+              <w:rPr>
+                <w:rFonts w:ascii="Calibri" w:cs="Calibri" w:eastAsia="Calibri" w:hAnsi="Calibri"/>
+                <w:b w:val="false"/>
+                <w:bCs w:val="false"/>
+                <w:color w:val="24303F"/>
+                <w:sz w:val="13"/>
+                <w:szCs w:val="13"/>
+              </w:rPr>
+              <w:t xml:space="preserve">Full (HIPAA is a paid add-on)</w:t>
+            </w:r>
+          </w:p>
+        </w:tc>
+        <w:tc>
+          <w:tcPr>
+            <w:tcW w:type="dxa" w:w="3800"/>
+            <w:tcBorders>
+              <w:top w:val="single" w:color="D9DEE8" w:sz="4"/>
+              <w:left w:val="single" w:color="D9DEE8" w:sz="4"/>
+              <w:bottom w:val="single" w:color="D9DEE8" w:sz="4"/>
+              <w:right w:val="single" w:color="D9DEE8" w:sz="4"/>
+            </w:tcBorders>
+            <w:shd w:fill="FFFFFF" w:color="auto" w:val="clear"/>
+            <w:tcMar>
+              <w:top w:type="dxa" w:w="58"/>
+              <w:left w:type="dxa" w:w="90"/>
+              <w:bottom w:type="dxa" w:w="58"/>
+              <w:right w:type="dxa" w:w="90"/>
+            </w:tcMar>
+          </w:tcPr>
+          <w:p>
+            <w:pPr>
+              <w:spacing w:after="0" w:line="246"/>
+            </w:pPr>
+            <w:r>
+              <w:rPr>
+                <w:rFonts w:ascii="Calibri" w:cs="Calibri" w:eastAsia="Calibri" w:hAnsi="Calibri"/>
+                <w:b w:val="false"/>
+                <w:bCs w:val="false"/>
+                <w:color w:val="24303F"/>
+                <w:sz w:val="13"/>
+                <w:szCs w:val="13"/>
+              </w:rPr>
+              <w:t xml:space="preserve">One platform for CRM, funnels, email and booking</w:t>
             </w:r>
           </w:p>
         </w:tc>
@@ -878,6 +905,40 @@
       <w:tr>
         <w:tc>
           <w:tcPr>
+            <w:tcW w:type="dxa" w:w="1550"/>
+            <w:tcBorders>
+              <w:top w:val="single" w:color="D9DEE8" w:sz="4"/>
+              <w:left w:val="single" w:color="D9DEE8" w:sz="4"/>
+              <w:bottom w:val="single" w:color="D9DEE8" w:sz="4"/>
+              <w:right w:val="single" w:color="D9DEE8" w:sz="4"/>
+            </w:tcBorders>
+            <w:shd w:fill="FFFFFF" w:color="auto" w:val="clear"/>
+            <w:tcMar>
+              <w:top w:type="dxa" w:w="58"/>
+              <w:left w:type="dxa" w:w="90"/>
+              <w:bottom w:type="dxa" w:w="58"/>
+              <w:right w:type="dxa" w:w="90"/>
+            </w:tcMar>
+          </w:tcPr>
+          <w:p>
+            <w:pPr>
+              <w:spacing w:after="0" w:line="246"/>
+            </w:pPr>
+            <w:r>
+              <w:rPr>
+                <w:rFonts w:ascii="Calibri" w:cs="Calibri" w:eastAsia="Calibri" w:hAnsi="Calibri"/>
+                <w:b w:val="false"/>
+                <w:bCs w:val="false"/>
+                <w:color w:val="24303F"/>
+                <w:sz w:val="13"/>
+                <w:szCs w:val="13"/>
+              </w:rPr>
+              <w:t xml:space="preserve">Vendasta</w:t>
+            </w:r>
+          </w:p>
+        </w:tc>
+        <w:tc>
+          <w:tcPr>
             <w:tcW w:type="dxa" w:w="1750"/>
             <w:tcBorders>
               <w:top w:val="single" w:color="D9DEE8" w:sz="4"/>
@@ -906,109 +967,75 @@
                 <w:sz w:val="13"/>
                 <w:szCs w:val="13"/>
               </w:rPr>
-              <w:t xml:space="preserve">Website &amp; funnel builders</w:t>
-            </w:r>
-          </w:p>
-        </w:tc>
-        <w:tc>
-          <w:tcPr>
-            <w:tcW w:type="dxa" w:w="2500"/>
-            <w:tcBorders>
-              <w:top w:val="single" w:color="D9DEE8" w:sz="4"/>
-              <w:left w:val="single" w:color="D9DEE8" w:sz="4"/>
-              <w:bottom w:val="single" w:color="D9DEE8" w:sz="4"/>
-              <w:right w:val="single" w:color="D9DEE8" w:sz="4"/>
-            </w:tcBorders>
-            <w:shd w:fill="FFFFFF" w:color="auto" w:val="clear"/>
-            <w:tcMar>
-              <w:top w:type="dxa" w:w="58"/>
-              <w:left w:type="dxa" w:w="90"/>
-              <w:bottom w:type="dxa" w:w="58"/>
-              <w:right w:type="dxa" w:w="90"/>
-            </w:tcMar>
-          </w:tcPr>
-          <w:p>
-            <w:pPr>
-              <w:spacing w:after="0" w:line="246"/>
-            </w:pPr>
-            <w:r>
-              <w:rPr>
-                <w:rFonts w:ascii="Calibri" w:cs="Calibri" w:eastAsia="Calibri" w:hAnsi="Calibri"/>
-                <w:b w:val="false"/>
-                <w:bCs w:val="false"/>
-                <w:color w:val="24303F"/>
-                <w:sz w:val="13"/>
-                <w:szCs w:val="13"/>
-              </w:rPr>
-              <w:t xml:space="preserve">Sites, landing pages, hosting</w:t>
-            </w:r>
-          </w:p>
-        </w:tc>
-        <w:tc>
-          <w:tcPr>
-            <w:tcW w:type="dxa" w:w="2600"/>
-            <w:tcBorders>
-              <w:top w:val="single" w:color="D9DEE8" w:sz="4"/>
-              <w:left w:val="single" w:color="D9DEE8" w:sz="4"/>
-              <w:bottom w:val="single" w:color="D9DEE8" w:sz="4"/>
-              <w:right w:val="single" w:color="D9DEE8" w:sz="4"/>
-            </w:tcBorders>
-            <w:shd w:fill="FFFFFF" w:color="auto" w:val="clear"/>
-            <w:tcMar>
-              <w:top w:type="dxa" w:w="58"/>
-              <w:left w:type="dxa" w:w="90"/>
-              <w:bottom w:type="dxa" w:w="58"/>
-              <w:right w:type="dxa" w:w="90"/>
-            </w:tcMar>
-          </w:tcPr>
-          <w:p>
-            <w:pPr>
-              <w:spacing w:after="0" w:line="246"/>
-            </w:pPr>
-            <w:r>
-              <w:rPr>
-                <w:rFonts w:ascii="Calibri" w:cs="Calibri" w:eastAsia="Calibri" w:hAnsi="Calibri"/>
-                <w:b w:val="false"/>
-                <w:bCs w:val="false"/>
-                <w:color w:val="24303F"/>
-                <w:sz w:val="13"/>
-                <w:szCs w:val="13"/>
-              </w:rPr>
-              <w:t xml:space="preserve">Steady, low churn once live</w:t>
-            </w:r>
-          </w:p>
-        </w:tc>
-        <w:tc>
-          <w:tcPr>
-            <w:tcW w:type="dxa" w:w="2510"/>
-            <w:tcBorders>
-              <w:top w:val="single" w:color="D9DEE8" w:sz="4"/>
-              <w:left w:val="single" w:color="D9DEE8" w:sz="4"/>
-              <w:bottom w:val="single" w:color="D9DEE8" w:sz="4"/>
-              <w:right w:val="single" w:color="D9DEE8" w:sz="4"/>
-            </w:tcBorders>
-            <w:shd w:fill="FFFFFF" w:color="auto" w:val="clear"/>
-            <w:tcMar>
-              <w:top w:type="dxa" w:w="58"/>
-              <w:left w:type="dxa" w:w="90"/>
-              <w:bottom w:type="dxa" w:w="58"/>
-              <w:right w:type="dxa" w:w="90"/>
-            </w:tcMar>
-          </w:tcPr>
-          <w:p>
-            <w:pPr>
-              <w:spacing w:after="0" w:line="246"/>
-            </w:pPr>
-            <w:r>
-              <w:rPr>
-                <w:rFonts w:ascii="Calibri" w:cs="Calibri" w:eastAsia="Calibri" w:hAnsi="Calibri"/>
-                <w:b w:val="false"/>
-                <w:bCs w:val="false"/>
-                <w:color w:val="24303F"/>
-                <w:sz w:val="13"/>
-                <w:szCs w:val="13"/>
-              </w:rPr>
-              <w:t xml:space="preserve">Commoditised; margin thins as builders get cheaper</w:t>
+              <w:t xml:space="preserve">Marketplace</w:t>
+            </w:r>
+          </w:p>
+        </w:tc>
+        <w:tc>
+          <w:tcPr>
+            <w:tcW w:type="dxa" w:w="2260"/>
+            <w:tcBorders>
+              <w:top w:val="single" w:color="D9DEE8" w:sz="4"/>
+              <w:left w:val="single" w:color="D9DEE8" w:sz="4"/>
+              <w:bottom w:val="single" w:color="D9DEE8" w:sz="4"/>
+              <w:right w:val="single" w:color="D9DEE8" w:sz="4"/>
+            </w:tcBorders>
+            <w:shd w:fill="FFFFFF" w:color="auto" w:val="clear"/>
+            <w:tcMar>
+              <w:top w:type="dxa" w:w="58"/>
+              <w:left w:type="dxa" w:w="90"/>
+              <w:bottom w:type="dxa" w:w="58"/>
+              <w:right w:type="dxa" w:w="90"/>
+            </w:tcMar>
+          </w:tcPr>
+          <w:p>
+            <w:pPr>
+              <w:spacing w:after="0" w:line="246"/>
+            </w:pPr>
+            <w:r>
+              <w:rPr>
+                <w:rFonts w:ascii="Calibri" w:cs="Calibri" w:eastAsia="Calibri" w:hAnsi="Calibri"/>
+                <w:b w:val="false"/>
+                <w:bCs w:val="false"/>
+                <w:color w:val="24303F"/>
+                <w:sz w:val="13"/>
+                <w:szCs w:val="13"/>
+              </w:rPr>
+              <w:t xml:space="preserve">Full; SOC 2 Type II</w:t>
+            </w:r>
+          </w:p>
+        </w:tc>
+        <w:tc>
+          <w:tcPr>
+            <w:tcW w:type="dxa" w:w="3800"/>
+            <w:tcBorders>
+              <w:top w:val="single" w:color="D9DEE8" w:sz="4"/>
+              <w:left w:val="single" w:color="D9DEE8" w:sz="4"/>
+              <w:bottom w:val="single" w:color="D9DEE8" w:sz="4"/>
+              <w:right w:val="single" w:color="D9DEE8" w:sz="4"/>
+            </w:tcBorders>
+            <w:shd w:fill="FFFFFF" w:color="auto" w:val="clear"/>
+            <w:tcMar>
+              <w:top w:type="dxa" w:w="58"/>
+              <w:left w:type="dxa" w:w="90"/>
+              <w:bottom w:type="dxa" w:w="58"/>
+              <w:right w:type="dxa" w:w="90"/>
+            </w:tcMar>
+          </w:tcPr>
+          <w:p>
+            <w:pPr>
+              <w:spacing w:after="0" w:line="246"/>
+            </w:pPr>
+            <w:r>
+              <w:rPr>
+                <w:rFonts w:ascii="Calibri" w:cs="Calibri" w:eastAsia="Calibri" w:hAnsi="Calibri"/>
+                <w:b w:val="false"/>
+                <w:bCs w:val="false"/>
+                <w:color w:val="24303F"/>
+                <w:sz w:val="13"/>
+                <w:szCs w:val="13"/>
+              </w:rPr>
+              <w:t xml:space="preserve">Reselling a broad catalogue of digital services</w:t>
             </w:r>
           </w:p>
         </w:tc>
@@ -1016,6 +1043,40 @@
       <w:tr>
         <w:tc>
           <w:tcPr>
+            <w:tcW w:type="dxa" w:w="1550"/>
+            <w:tcBorders>
+              <w:top w:val="single" w:color="D9DEE8" w:sz="4"/>
+              <w:left w:val="single" w:color="D9DEE8" w:sz="4"/>
+              <w:bottom w:val="single" w:color="D9DEE8" w:sz="4"/>
+              <w:right w:val="single" w:color="D9DEE8" w:sz="4"/>
+            </w:tcBorders>
+            <w:shd w:fill="FFFFFF" w:color="auto" w:val="clear"/>
+            <w:tcMar>
+              <w:top w:type="dxa" w:w="58"/>
+              <w:left w:type="dxa" w:w="90"/>
+              <w:bottom w:type="dxa" w:w="58"/>
+              <w:right w:type="dxa" w:w="90"/>
+            </w:tcMar>
+          </w:tcPr>
+          <w:p>
+            <w:pPr>
+              <w:spacing w:after="0" w:line="246"/>
+            </w:pPr>
+            <w:r>
+              <w:rPr>
+                <w:rFonts w:ascii="Calibri" w:cs="Calibri" w:eastAsia="Calibri" w:hAnsi="Calibri"/>
+                <w:b w:val="false"/>
+                <w:bCs w:val="false"/>
+                <w:color w:val="24303F"/>
+                <w:sz w:val="13"/>
+                <w:szCs w:val="13"/>
+              </w:rPr>
+              <w:t xml:space="preserve">Duda</w:t>
+            </w:r>
+          </w:p>
+        </w:tc>
+        <w:tc>
+          <w:tcPr>
             <w:tcW w:type="dxa" w:w="1750"/>
             <w:tcBorders>
               <w:top w:val="single" w:color="D9DEE8" w:sz="4"/>
@@ -1044,109 +1105,75 @@
                 <w:sz w:val="13"/>
                 <w:szCs w:val="13"/>
               </w:rPr>
-              <w:t xml:space="preserve">SEO &amp; reporting</w:t>
-            </w:r>
-          </w:p>
-        </w:tc>
-        <w:tc>
-          <w:tcPr>
-            <w:tcW w:type="dxa" w:w="2500"/>
-            <w:tcBorders>
-              <w:top w:val="single" w:color="D9DEE8" w:sz="4"/>
-              <w:left w:val="single" w:color="D9DEE8" w:sz="4"/>
-              <w:bottom w:val="single" w:color="D9DEE8" w:sz="4"/>
-              <w:right w:val="single" w:color="D9DEE8" w:sz="4"/>
-            </w:tcBorders>
-            <w:shd w:fill="FFFFFF" w:color="auto" w:val="clear"/>
-            <w:tcMar>
-              <w:top w:type="dxa" w:w="58"/>
-              <w:left w:type="dxa" w:w="90"/>
-              <w:bottom w:type="dxa" w:w="58"/>
-              <w:right w:type="dxa" w:w="90"/>
-            </w:tcMar>
-          </w:tcPr>
-          <w:p>
-            <w:pPr>
-              <w:spacing w:after="0" w:line="246"/>
-            </w:pPr>
-            <w:r>
-              <w:rPr>
-                <w:rFonts w:ascii="Calibri" w:cs="Calibri" w:eastAsia="Calibri" w:hAnsi="Calibri"/>
-                <w:b w:val="false"/>
-                <w:bCs w:val="false"/>
-                <w:color w:val="24303F"/>
-                <w:sz w:val="13"/>
-                <w:szCs w:val="13"/>
-              </w:rPr>
-              <w:t xml:space="preserve">Rank tracking, audits, client reports</w:t>
-            </w:r>
-          </w:p>
-        </w:tc>
-        <w:tc>
-          <w:tcPr>
-            <w:tcW w:type="dxa" w:w="2600"/>
-            <w:tcBorders>
-              <w:top w:val="single" w:color="D9DEE8" w:sz="4"/>
-              <w:left w:val="single" w:color="D9DEE8" w:sz="4"/>
-              <w:bottom w:val="single" w:color="D9DEE8" w:sz="4"/>
-              <w:right w:val="single" w:color="D9DEE8" w:sz="4"/>
-            </w:tcBorders>
-            <w:shd w:fill="FFFFFF" w:color="auto" w:val="clear"/>
-            <w:tcMar>
-              <w:top w:type="dxa" w:w="58"/>
-              <w:left w:type="dxa" w:w="90"/>
-              <w:bottom w:type="dxa" w:w="58"/>
-              <w:right w:type="dxa" w:w="90"/>
-            </w:tcMar>
-          </w:tcPr>
-          <w:p>
-            <w:pPr>
-              <w:spacing w:after="0" w:line="246"/>
-            </w:pPr>
-            <w:r>
-              <w:rPr>
-                <w:rFonts w:ascii="Calibri" w:cs="Calibri" w:eastAsia="Calibri" w:hAnsi="Calibri"/>
-                <w:b w:val="false"/>
-                <w:bCs w:val="false"/>
-                <w:color w:val="24303F"/>
-                <w:sz w:val="13"/>
-                <w:szCs w:val="13"/>
-              </w:rPr>
-              <w:t xml:space="preserve">Sticky if tied to a retainer</w:t>
-            </w:r>
-          </w:p>
-        </w:tc>
-        <w:tc>
-          <w:tcPr>
-            <w:tcW w:type="dxa" w:w="2510"/>
-            <w:tcBorders>
-              <w:top w:val="single" w:color="D9DEE8" w:sz="4"/>
-              <w:left w:val="single" w:color="D9DEE8" w:sz="4"/>
-              <w:bottom w:val="single" w:color="D9DEE8" w:sz="4"/>
-              <w:right w:val="single" w:color="D9DEE8" w:sz="4"/>
-            </w:tcBorders>
-            <w:shd w:fill="FFFFFF" w:color="auto" w:val="clear"/>
-            <w:tcMar>
-              <w:top w:type="dxa" w:w="58"/>
-              <w:left w:type="dxa" w:w="90"/>
-              <w:bottom w:type="dxa" w:w="58"/>
-              <w:right w:type="dxa" w:w="90"/>
-            </w:tcMar>
-          </w:tcPr>
-          <w:p>
-            <w:pPr>
-              <w:spacing w:after="0" w:line="246"/>
-            </w:pPr>
-            <w:r>
-              <w:rPr>
-                <w:rFonts w:ascii="Calibri" w:cs="Calibri" w:eastAsia="Calibri" w:hAnsi="Calibri"/>
-                <w:b w:val="false"/>
-                <w:bCs w:val="false"/>
-                <w:color w:val="24303F"/>
-                <w:sz w:val="13"/>
-                <w:szCs w:val="13"/>
-              </w:rPr>
-              <w:t xml:space="preserve">Value is the report; easy for clients to question spend</w:t>
+              <w:t xml:space="preserve">Website builder</w:t>
+            </w:r>
+          </w:p>
+        </w:tc>
+        <w:tc>
+          <w:tcPr>
+            <w:tcW w:type="dxa" w:w="2260"/>
+            <w:tcBorders>
+              <w:top w:val="single" w:color="D9DEE8" w:sz="4"/>
+              <w:left w:val="single" w:color="D9DEE8" w:sz="4"/>
+              <w:bottom w:val="single" w:color="D9DEE8" w:sz="4"/>
+              <w:right w:val="single" w:color="D9DEE8" w:sz="4"/>
+            </w:tcBorders>
+            <w:shd w:fill="FFFFFF" w:color="auto" w:val="clear"/>
+            <w:tcMar>
+              <w:top w:type="dxa" w:w="58"/>
+              <w:left w:type="dxa" w:w="90"/>
+              <w:bottom w:type="dxa" w:w="58"/>
+              <w:right w:type="dxa" w:w="90"/>
+            </w:tcMar>
+          </w:tcPr>
+          <w:p>
+            <w:pPr>
+              <w:spacing w:after="0" w:line="246"/>
+            </w:pPr>
+            <w:r>
+              <w:rPr>
+                <w:rFonts w:ascii="Calibri" w:cs="Calibri" w:eastAsia="Calibri" w:hAnsi="Calibri"/>
+                <w:b w:val="false"/>
+                <w:bCs w:val="false"/>
+                <w:color w:val="24303F"/>
+                <w:sz w:val="13"/>
+                <w:szCs w:val="13"/>
+              </w:rPr>
+              <w:t xml:space="preserve">Full</w:t>
+            </w:r>
+          </w:p>
+        </w:tc>
+        <w:tc>
+          <w:tcPr>
+            <w:tcW w:type="dxa" w:w="3800"/>
+            <w:tcBorders>
+              <w:top w:val="single" w:color="D9DEE8" w:sz="4"/>
+              <w:left w:val="single" w:color="D9DEE8" w:sz="4"/>
+              <w:bottom w:val="single" w:color="D9DEE8" w:sz="4"/>
+              <w:right w:val="single" w:color="D9DEE8" w:sz="4"/>
+            </w:tcBorders>
+            <w:shd w:fill="FFFFFF" w:color="auto" w:val="clear"/>
+            <w:tcMar>
+              <w:top w:type="dxa" w:w="58"/>
+              <w:left w:type="dxa" w:w="90"/>
+              <w:bottom w:type="dxa" w:w="58"/>
+              <w:right w:type="dxa" w:w="90"/>
+            </w:tcMar>
+          </w:tcPr>
+          <w:p>
+            <w:pPr>
+              <w:spacing w:after="0" w:line="246"/>
+            </w:pPr>
+            <w:r>
+              <w:rPr>
+                <w:rFonts w:ascii="Calibri" w:cs="Calibri" w:eastAsia="Calibri" w:hAnsi="Calibri"/>
+                <w:b w:val="false"/>
+                <w:bCs w:val="false"/>
+                <w:color w:val="24303F"/>
+                <w:sz w:val="13"/>
+                <w:szCs w:val="13"/>
+              </w:rPr>
+              <w:t xml:space="preserve">High-volume, polished client sites</w:t>
             </w:r>
           </w:p>
         </w:tc>
@@ -1154,6 +1181,40 @@
       <w:tr>
         <w:tc>
           <w:tcPr>
+            <w:tcW w:type="dxa" w:w="1550"/>
+            <w:tcBorders>
+              <w:top w:val="single" w:color="D9DEE8" w:sz="4"/>
+              <w:left w:val="single" w:color="D9DEE8" w:sz="4"/>
+              <w:bottom w:val="single" w:color="D9DEE8" w:sz="4"/>
+              <w:right w:val="single" w:color="D9DEE8" w:sz="4"/>
+            </w:tcBorders>
+            <w:shd w:fill="FFFFFF" w:color="auto" w:val="clear"/>
+            <w:tcMar>
+              <w:top w:type="dxa" w:w="58"/>
+              <w:left w:type="dxa" w:w="90"/>
+              <w:bottom w:type="dxa" w:w="58"/>
+              <w:right w:type="dxa" w:w="90"/>
+            </w:tcMar>
+          </w:tcPr>
+          <w:p>
+            <w:pPr>
+              <w:spacing w:after="0" w:line="246"/>
+            </w:pPr>
+            <w:r>
+              <w:rPr>
+                <w:rFonts w:ascii="Calibri" w:cs="Calibri" w:eastAsia="Calibri" w:hAnsi="Calibri"/>
+                <w:b w:val="false"/>
+                <w:bCs w:val="false"/>
+                <w:color w:val="24303F"/>
+                <w:sz w:val="13"/>
+                <w:szCs w:val="13"/>
+              </w:rPr>
+              <w:t xml:space="preserve">Simvoly</w:t>
+            </w:r>
+          </w:p>
+        </w:tc>
+        <w:tc>
+          <w:tcPr>
             <w:tcW w:type="dxa" w:w="1750"/>
             <w:tcBorders>
               <w:top w:val="single" w:color="D9DEE8" w:sz="4"/>
@@ -1182,109 +1243,75 @@
                 <w:sz w:val="13"/>
                 <w:szCs w:val="13"/>
               </w:rPr>
-              <w:t xml:space="preserve">Email &amp; automation</w:t>
-            </w:r>
-          </w:p>
-        </w:tc>
-        <w:tc>
-          <w:tcPr>
-            <w:tcW w:type="dxa" w:w="2500"/>
-            <w:tcBorders>
-              <w:top w:val="single" w:color="D9DEE8" w:sz="4"/>
-              <w:left w:val="single" w:color="D9DEE8" w:sz="4"/>
-              <w:bottom w:val="single" w:color="D9DEE8" w:sz="4"/>
-              <w:right w:val="single" w:color="D9DEE8" w:sz="4"/>
-            </w:tcBorders>
-            <w:shd w:fill="FFFFFF" w:color="auto" w:val="clear"/>
-            <w:tcMar>
-              <w:top w:type="dxa" w:w="58"/>
-              <w:left w:type="dxa" w:w="90"/>
-              <w:bottom w:type="dxa" w:w="58"/>
-              <w:right w:type="dxa" w:w="90"/>
-            </w:tcMar>
-          </w:tcPr>
-          <w:p>
-            <w:pPr>
-              <w:spacing w:after="0" w:line="246"/>
-            </w:pPr>
-            <w:r>
-              <w:rPr>
-                <w:rFonts w:ascii="Calibri" w:cs="Calibri" w:eastAsia="Calibri" w:hAnsi="Calibri"/>
-                <w:b w:val="false"/>
-                <w:bCs w:val="false"/>
-                <w:color w:val="24303F"/>
-                <w:sz w:val="13"/>
-                <w:szCs w:val="13"/>
-              </w:rPr>
-              <w:t xml:space="preserve">Campaigns, sequences, CRM flows</w:t>
-            </w:r>
-          </w:p>
-        </w:tc>
-        <w:tc>
-          <w:tcPr>
-            <w:tcW w:type="dxa" w:w="2600"/>
-            <w:tcBorders>
-              <w:top w:val="single" w:color="D9DEE8" w:sz="4"/>
-              <w:left w:val="single" w:color="D9DEE8" w:sz="4"/>
-              <w:bottom w:val="single" w:color="D9DEE8" w:sz="4"/>
-              <w:right w:val="single" w:color="D9DEE8" w:sz="4"/>
-            </w:tcBorders>
-            <w:shd w:fill="FFFFFF" w:color="auto" w:val="clear"/>
-            <w:tcMar>
-              <w:top w:type="dxa" w:w="58"/>
-              <w:left w:type="dxa" w:w="90"/>
-              <w:bottom w:type="dxa" w:w="58"/>
-              <w:right w:type="dxa" w:w="90"/>
-            </w:tcMar>
-          </w:tcPr>
-          <w:p>
-            <w:pPr>
-              <w:spacing w:after="0" w:line="246"/>
-            </w:pPr>
-            <w:r>
-              <w:rPr>
-                <w:rFonts w:ascii="Calibri" w:cs="Calibri" w:eastAsia="Calibri" w:hAnsi="Calibri"/>
-                <w:b w:val="false"/>
-                <w:bCs w:val="false"/>
-                <w:color w:val="24303F"/>
-                <w:sz w:val="13"/>
-                <w:szCs w:val="13"/>
-              </w:rPr>
-              <w:t xml:space="preserve">Good margin, moderate churn</w:t>
-            </w:r>
-          </w:p>
-        </w:tc>
-        <w:tc>
-          <w:tcPr>
-            <w:tcW w:type="dxa" w:w="2510"/>
-            <w:tcBorders>
-              <w:top w:val="single" w:color="D9DEE8" w:sz="4"/>
-              <w:left w:val="single" w:color="D9DEE8" w:sz="4"/>
-              <w:bottom w:val="single" w:color="D9DEE8" w:sz="4"/>
-              <w:right w:val="single" w:color="D9DEE8" w:sz="4"/>
-            </w:tcBorders>
-            <w:shd w:fill="FFFFFF" w:color="auto" w:val="clear"/>
-            <w:tcMar>
-              <w:top w:type="dxa" w:w="58"/>
-              <w:left w:type="dxa" w:w="90"/>
-              <w:bottom w:type="dxa" w:w="58"/>
-              <w:right w:type="dxa" w:w="90"/>
-            </w:tcMar>
-          </w:tcPr>
-          <w:p>
-            <w:pPr>
-              <w:spacing w:after="0" w:line="246"/>
-            </w:pPr>
-            <w:r>
-              <w:rPr>
-                <w:rFonts w:ascii="Calibri" w:cs="Calibri" w:eastAsia="Calibri" w:hAnsi="Calibri"/>
-                <w:b w:val="false"/>
-                <w:bCs w:val="false"/>
-                <w:color w:val="24303F"/>
-                <w:sz w:val="13"/>
-                <w:szCs w:val="13"/>
-              </w:rPr>
-              <w:t xml:space="preserve">Deliverability and support fall on you</w:t>
+              <w:t xml:space="preserve">Sites + funnels + CRM</w:t>
+            </w:r>
+          </w:p>
+        </w:tc>
+        <w:tc>
+          <w:tcPr>
+            <w:tcW w:type="dxa" w:w="2260"/>
+            <w:tcBorders>
+              <w:top w:val="single" w:color="D9DEE8" w:sz="4"/>
+              <w:left w:val="single" w:color="D9DEE8" w:sz="4"/>
+              <w:bottom w:val="single" w:color="D9DEE8" w:sz="4"/>
+              <w:right w:val="single" w:color="D9DEE8" w:sz="4"/>
+            </w:tcBorders>
+            <w:shd w:fill="FFFFFF" w:color="auto" w:val="clear"/>
+            <w:tcMar>
+              <w:top w:type="dxa" w:w="58"/>
+              <w:left w:type="dxa" w:w="90"/>
+              <w:bottom w:type="dxa" w:w="58"/>
+              <w:right w:type="dxa" w:w="90"/>
+            </w:tcMar>
+          </w:tcPr>
+          <w:p>
+            <w:pPr>
+              <w:spacing w:after="0" w:line="246"/>
+            </w:pPr>
+            <w:r>
+              <w:rPr>
+                <w:rFonts w:ascii="Calibri" w:cs="Calibri" w:eastAsia="Calibri" w:hAnsi="Calibri"/>
+                <w:b w:val="false"/>
+                <w:bCs w:val="false"/>
+                <w:color w:val="24303F"/>
+                <w:sz w:val="13"/>
+                <w:szCs w:val="13"/>
+              </w:rPr>
+              <w:t xml:space="preserve">Full; reseller from ~$59/mo</w:t>
+            </w:r>
+          </w:p>
+        </w:tc>
+        <w:tc>
+          <w:tcPr>
+            <w:tcW w:type="dxa" w:w="3800"/>
+            <w:tcBorders>
+              <w:top w:val="single" w:color="D9DEE8" w:sz="4"/>
+              <w:left w:val="single" w:color="D9DEE8" w:sz="4"/>
+              <w:bottom w:val="single" w:color="D9DEE8" w:sz="4"/>
+              <w:right w:val="single" w:color="D9DEE8" w:sz="4"/>
+            </w:tcBorders>
+            <w:shd w:fill="FFFFFF" w:color="auto" w:val="clear"/>
+            <w:tcMar>
+              <w:top w:type="dxa" w:w="58"/>
+              <w:left w:type="dxa" w:w="90"/>
+              <w:bottom w:type="dxa" w:w="58"/>
+              <w:right w:type="dxa" w:w="90"/>
+            </w:tcMar>
+          </w:tcPr>
+          <w:p>
+            <w:pPr>
+              <w:spacing w:after="0" w:line="246"/>
+            </w:pPr>
+            <w:r>
+              <w:rPr>
+                <w:rFonts w:ascii="Calibri" w:cs="Calibri" w:eastAsia="Calibri" w:hAnsi="Calibri"/>
+                <w:b w:val="false"/>
+                <w:bCs w:val="false"/>
+                <w:color w:val="24303F"/>
+                <w:sz w:val="13"/>
+                <w:szCs w:val="13"/>
+              </w:rPr>
+              <w:t xml:space="preserve">Sites plus funnels under one brand</w:t>
             </w:r>
           </w:p>
         </w:tc>
@@ -1292,6 +1319,40 @@
       <w:tr>
         <w:tc>
           <w:tcPr>
+            <w:tcW w:type="dxa" w:w="1550"/>
+            <w:tcBorders>
+              <w:top w:val="single" w:color="D9DEE8" w:sz="4"/>
+              <w:left w:val="single" w:color="D9DEE8" w:sz="4"/>
+              <w:bottom w:val="single" w:color="D9DEE8" w:sz="4"/>
+              <w:right w:val="single" w:color="D9DEE8" w:sz="4"/>
+            </w:tcBorders>
+            <w:shd w:fill="FFFFFF" w:color="auto" w:val="clear"/>
+            <w:tcMar>
+              <w:top w:type="dxa" w:w="58"/>
+              <w:left w:type="dxa" w:w="90"/>
+              <w:bottom w:type="dxa" w:w="58"/>
+              <w:right w:type="dxa" w:w="90"/>
+            </w:tcMar>
+          </w:tcPr>
+          <w:p>
+            <w:pPr>
+              <w:spacing w:after="0" w:line="246"/>
+            </w:pPr>
+            <w:r>
+              <w:rPr>
+                <w:rFonts w:ascii="Calibri" w:cs="Calibri" w:eastAsia="Calibri" w:hAnsi="Calibri"/>
+                <w:b w:val="false"/>
+                <w:bCs w:val="false"/>
+                <w:color w:val="24303F"/>
+                <w:sz w:val="13"/>
+                <w:szCs w:val="13"/>
+              </w:rPr>
+              <w:t xml:space="preserve">SE Ranking</w:t>
+            </w:r>
+          </w:p>
+        </w:tc>
+        <w:tc>
+          <w:tcPr>
             <w:tcW w:type="dxa" w:w="1750"/>
             <w:tcBorders>
               <w:top w:val="single" w:color="D9DEE8" w:sz="4"/>
@@ -1320,109 +1381,75 @@
                 <w:sz w:val="13"/>
                 <w:szCs w:val="13"/>
               </w:rPr>
-              <w:t xml:space="preserve">Review &amp; social management</w:t>
-            </w:r>
-          </w:p>
-        </w:tc>
-        <w:tc>
-          <w:tcPr>
-            <w:tcW w:type="dxa" w:w="2500"/>
-            <w:tcBorders>
-              <w:top w:val="single" w:color="D9DEE8" w:sz="4"/>
-              <w:left w:val="single" w:color="D9DEE8" w:sz="4"/>
-              <w:bottom w:val="single" w:color="D9DEE8" w:sz="4"/>
-              <w:right w:val="single" w:color="D9DEE8" w:sz="4"/>
-            </w:tcBorders>
-            <w:shd w:fill="FFFFFF" w:color="auto" w:val="clear"/>
-            <w:tcMar>
-              <w:top w:type="dxa" w:w="58"/>
-              <w:left w:type="dxa" w:w="90"/>
-              <w:bottom w:type="dxa" w:w="58"/>
-              <w:right w:type="dxa" w:w="90"/>
-            </w:tcMar>
-          </w:tcPr>
-          <w:p>
-            <w:pPr>
-              <w:spacing w:after="0" w:line="246"/>
-            </w:pPr>
-            <w:r>
-              <w:rPr>
-                <w:rFonts w:ascii="Calibri" w:cs="Calibri" w:eastAsia="Calibri" w:hAnsi="Calibri"/>
-                <w:b w:val="false"/>
-                <w:bCs w:val="false"/>
-                <w:color w:val="24303F"/>
-                <w:sz w:val="13"/>
-                <w:szCs w:val="13"/>
-              </w:rPr>
-              <w:t xml:space="preserve">Reviews, posting, listings</w:t>
-            </w:r>
-          </w:p>
-        </w:tc>
-        <w:tc>
-          <w:tcPr>
-            <w:tcW w:type="dxa" w:w="2600"/>
-            <w:tcBorders>
-              <w:top w:val="single" w:color="D9DEE8" w:sz="4"/>
-              <w:left w:val="single" w:color="D9DEE8" w:sz="4"/>
-              <w:bottom w:val="single" w:color="D9DEE8" w:sz="4"/>
-              <w:right w:val="single" w:color="D9DEE8" w:sz="4"/>
-            </w:tcBorders>
-            <w:shd w:fill="FFFFFF" w:color="auto" w:val="clear"/>
-            <w:tcMar>
-              <w:top w:type="dxa" w:w="58"/>
-              <w:left w:type="dxa" w:w="90"/>
-              <w:bottom w:type="dxa" w:w="58"/>
-              <w:right w:type="dxa" w:w="90"/>
-            </w:tcMar>
-          </w:tcPr>
-          <w:p>
-            <w:pPr>
-              <w:spacing w:after="0" w:line="246"/>
-            </w:pPr>
-            <w:r>
-              <w:rPr>
-                <w:rFonts w:ascii="Calibri" w:cs="Calibri" w:eastAsia="Calibri" w:hAnsi="Calibri"/>
-                <w:b w:val="false"/>
-                <w:bCs w:val="false"/>
-                <w:color w:val="24303F"/>
-                <w:sz w:val="13"/>
-                <w:szCs w:val="13"/>
-              </w:rPr>
-              <w:t xml:space="preserve">Reliable add-on revenue</w:t>
-            </w:r>
-          </w:p>
-        </w:tc>
-        <w:tc>
-          <w:tcPr>
-            <w:tcW w:type="dxa" w:w="2510"/>
-            <w:tcBorders>
-              <w:top w:val="single" w:color="D9DEE8" w:sz="4"/>
-              <w:left w:val="single" w:color="D9DEE8" w:sz="4"/>
-              <w:bottom w:val="single" w:color="D9DEE8" w:sz="4"/>
-              <w:right w:val="single" w:color="D9DEE8" w:sz="4"/>
-            </w:tcBorders>
-            <w:shd w:fill="FFFFFF" w:color="auto" w:val="clear"/>
-            <w:tcMar>
-              <w:top w:type="dxa" w:w="58"/>
-              <w:left w:type="dxa" w:w="90"/>
-              <w:bottom w:type="dxa" w:w="58"/>
-              <w:right w:type="dxa" w:w="90"/>
-            </w:tcMar>
-          </w:tcPr>
-          <w:p>
-            <w:pPr>
-              <w:spacing w:after="0" w:line="246"/>
-            </w:pPr>
-            <w:r>
-              <w:rPr>
-                <w:rFonts w:ascii="Calibri" w:cs="Calibri" w:eastAsia="Calibri" w:hAnsi="Calibri"/>
-                <w:b w:val="false"/>
-                <w:bCs w:val="false"/>
-                <w:color w:val="24303F"/>
-                <w:sz w:val="13"/>
-                <w:szCs w:val="13"/>
-              </w:rPr>
-              <w:t xml:space="preserve">Low differentiation; price pressure</w:t>
+              <w:t xml:space="preserve">SEO + reporting</w:t>
+            </w:r>
+          </w:p>
+        </w:tc>
+        <w:tc>
+          <w:tcPr>
+            <w:tcW w:type="dxa" w:w="2260"/>
+            <w:tcBorders>
+              <w:top w:val="single" w:color="D9DEE8" w:sz="4"/>
+              <w:left w:val="single" w:color="D9DEE8" w:sz="4"/>
+              <w:bottom w:val="single" w:color="D9DEE8" w:sz="4"/>
+              <w:right w:val="single" w:color="D9DEE8" w:sz="4"/>
+            </w:tcBorders>
+            <w:shd w:fill="FFFFFF" w:color="auto" w:val="clear"/>
+            <w:tcMar>
+              <w:top w:type="dxa" w:w="58"/>
+              <w:left w:type="dxa" w:w="90"/>
+              <w:bottom w:type="dxa" w:w="58"/>
+              <w:right w:type="dxa" w:w="90"/>
+            </w:tcMar>
+          </w:tcPr>
+          <w:p>
+            <w:pPr>
+              <w:spacing w:after="0" w:line="246"/>
+            </w:pPr>
+            <w:r>
+              <w:rPr>
+                <w:rFonts w:ascii="Calibri" w:cs="Calibri" w:eastAsia="Calibri" w:hAnsi="Calibri"/>
+                <w:b w:val="false"/>
+                <w:bCs w:val="false"/>
+                <w:color w:val="24303F"/>
+                <w:sz w:val="13"/>
+                <w:szCs w:val="13"/>
+              </w:rPr>
+              <w:t xml:space="preserve">Client portal (Agency Pack add-on)</w:t>
+            </w:r>
+          </w:p>
+        </w:tc>
+        <w:tc>
+          <w:tcPr>
+            <w:tcW w:type="dxa" w:w="3800"/>
+            <w:tcBorders>
+              <w:top w:val="single" w:color="D9DEE8" w:sz="4"/>
+              <w:left w:val="single" w:color="D9DEE8" w:sz="4"/>
+              <w:bottom w:val="single" w:color="D9DEE8" w:sz="4"/>
+              <w:right w:val="single" w:color="D9DEE8" w:sz="4"/>
+            </w:tcBorders>
+            <w:shd w:fill="FFFFFF" w:color="auto" w:val="clear"/>
+            <w:tcMar>
+              <w:top w:type="dxa" w:w="58"/>
+              <w:left w:type="dxa" w:w="90"/>
+              <w:bottom w:type="dxa" w:w="58"/>
+              <w:right w:type="dxa" w:w="90"/>
+            </w:tcMar>
+          </w:tcPr>
+          <w:p>
+            <w:pPr>
+              <w:spacing w:after="0" w:line="246"/>
+            </w:pPr>
+            <w:r>
+              <w:rPr>
+                <w:rFonts w:ascii="Calibri" w:cs="Calibri" w:eastAsia="Calibri" w:hAnsi="Calibri"/>
+                <w:b w:val="false"/>
+                <w:bCs w:val="false"/>
+                <w:color w:val="24303F"/>
+                <w:sz w:val="13"/>
+                <w:szCs w:val="13"/>
+              </w:rPr>
+              <w:t xml:space="preserve">Agencies that need the SEO data, not just a report</w:t>
             </w:r>
           </w:p>
         </w:tc>
@@ -1430,6 +1457,40 @@
       <w:tr>
         <w:tc>
           <w:tcPr>
+            <w:tcW w:type="dxa" w:w="1550"/>
+            <w:tcBorders>
+              <w:top w:val="single" w:color="D9DEE8" w:sz="4"/>
+              <w:left w:val="single" w:color="D9DEE8" w:sz="4"/>
+              <w:bottom w:val="single" w:color="D9DEE8" w:sz="4"/>
+              <w:right w:val="single" w:color="D9DEE8" w:sz="4"/>
+            </w:tcBorders>
+            <w:shd w:fill="FFFFFF" w:color="auto" w:val="clear"/>
+            <w:tcMar>
+              <w:top w:type="dxa" w:w="58"/>
+              <w:left w:type="dxa" w:w="90"/>
+              <w:bottom w:type="dxa" w:w="58"/>
+              <w:right w:type="dxa" w:w="90"/>
+            </w:tcMar>
+          </w:tcPr>
+          <w:p>
+            <w:pPr>
+              <w:spacing w:after="0" w:line="246"/>
+            </w:pPr>
+            <w:r>
+              <w:rPr>
+                <w:rFonts w:ascii="Calibri" w:cs="Calibri" w:eastAsia="Calibri" w:hAnsi="Calibri"/>
+                <w:b w:val="false"/>
+                <w:bCs w:val="false"/>
+                <w:color w:val="24303F"/>
+                <w:sz w:val="13"/>
+                <w:szCs w:val="13"/>
+              </w:rPr>
+              <w:t xml:space="preserve">AgencyAnalytics</w:t>
+            </w:r>
+          </w:p>
+        </w:tc>
+        <w:tc>
+          <w:tcPr>
             <w:tcW w:type="dxa" w:w="1750"/>
             <w:tcBorders>
               <w:top w:val="single" w:color="D9DEE8" w:sz="4"/>
@@ -1458,109 +1519,1041 @@
                 <w:sz w:val="13"/>
                 <w:szCs w:val="13"/>
               </w:rPr>
+              <w:t xml:space="preserve">Reporting</w:t>
+            </w:r>
+          </w:p>
+        </w:tc>
+        <w:tc>
+          <w:tcPr>
+            <w:tcW w:type="dxa" w:w="2260"/>
+            <w:tcBorders>
+              <w:top w:val="single" w:color="D9DEE8" w:sz="4"/>
+              <w:left w:val="single" w:color="D9DEE8" w:sz="4"/>
+              <w:bottom w:val="single" w:color="D9DEE8" w:sz="4"/>
+              <w:right w:val="single" w:color="D9DEE8" w:sz="4"/>
+            </w:tcBorders>
+            <w:shd w:fill="FFFFFF" w:color="auto" w:val="clear"/>
+            <w:tcMar>
+              <w:top w:type="dxa" w:w="58"/>
+              <w:left w:type="dxa" w:w="90"/>
+              <w:bottom w:type="dxa" w:w="58"/>
+              <w:right w:type="dxa" w:w="90"/>
+            </w:tcMar>
+          </w:tcPr>
+          <w:p>
+            <w:pPr>
+              <w:spacing w:after="0" w:line="246"/>
+            </w:pPr>
+            <w:r>
+              <w:rPr>
+                <w:rFonts w:ascii="Calibri" w:cs="Calibri" w:eastAsia="Calibri" w:hAnsi="Calibri"/>
+                <w:b w:val="false"/>
+                <w:bCs w:val="false"/>
+                <w:color w:val="24303F"/>
+                <w:sz w:val="13"/>
+                <w:szCs w:val="13"/>
+              </w:rPr>
+              <w:t xml:space="preserve">Branded reports</w:t>
+            </w:r>
+          </w:p>
+        </w:tc>
+        <w:tc>
+          <w:tcPr>
+            <w:tcW w:type="dxa" w:w="3800"/>
+            <w:tcBorders>
+              <w:top w:val="single" w:color="D9DEE8" w:sz="4"/>
+              <w:left w:val="single" w:color="D9DEE8" w:sz="4"/>
+              <w:bottom w:val="single" w:color="D9DEE8" w:sz="4"/>
+              <w:right w:val="single" w:color="D9DEE8" w:sz="4"/>
+            </w:tcBorders>
+            <w:shd w:fill="FFFFFF" w:color="auto" w:val="clear"/>
+            <w:tcMar>
+              <w:top w:type="dxa" w:w="58"/>
+              <w:left w:type="dxa" w:w="90"/>
+              <w:bottom w:type="dxa" w:w="58"/>
+              <w:right w:type="dxa" w:w="90"/>
+            </w:tcMar>
+          </w:tcPr>
+          <w:p>
+            <w:pPr>
+              <w:spacing w:after="0" w:line="246"/>
+            </w:pPr>
+            <w:r>
+              <w:rPr>
+                <w:rFonts w:ascii="Calibri" w:cs="Calibri" w:eastAsia="Calibri" w:hAnsi="Calibri"/>
+                <w:b w:val="false"/>
+                <w:bCs w:val="false"/>
+                <w:color w:val="24303F"/>
+                <w:sz w:val="13"/>
+                <w:szCs w:val="13"/>
+              </w:rPr>
+              <w:t xml:space="preserve">Turning other tools' data into client reports</w:t>
+            </w:r>
+          </w:p>
+        </w:tc>
+      </w:tr>
+      <w:tr>
+        <w:tc>
+          <w:tcPr>
+            <w:tcW w:type="dxa" w:w="1550"/>
+            <w:tcBorders>
+              <w:top w:val="single" w:color="D9DEE8" w:sz="4"/>
+              <w:left w:val="single" w:color="D9DEE8" w:sz="4"/>
+              <w:bottom w:val="single" w:color="D9DEE8" w:sz="4"/>
+              <w:right w:val="single" w:color="D9DEE8" w:sz="4"/>
+            </w:tcBorders>
+            <w:shd w:fill="FFFFFF" w:color="auto" w:val="clear"/>
+            <w:tcMar>
+              <w:top w:type="dxa" w:w="58"/>
+              <w:left w:type="dxa" w:w="90"/>
+              <w:bottom w:type="dxa" w:w="58"/>
+              <w:right w:type="dxa" w:w="90"/>
+            </w:tcMar>
+          </w:tcPr>
+          <w:p>
+            <w:pPr>
+              <w:spacing w:after="0" w:line="246"/>
+            </w:pPr>
+            <w:r>
+              <w:rPr>
+                <w:rFonts w:ascii="Calibri" w:cs="Calibri" w:eastAsia="Calibri" w:hAnsi="Calibri"/>
+                <w:b w:val="false"/>
+                <w:bCs w:val="false"/>
+                <w:color w:val="24303F"/>
+                <w:sz w:val="13"/>
+                <w:szCs w:val="13"/>
+              </w:rPr>
+              <w:t xml:space="preserve">Sendible</w:t>
+            </w:r>
+          </w:p>
+        </w:tc>
+        <w:tc>
+          <w:tcPr>
+            <w:tcW w:type="dxa" w:w="1750"/>
+            <w:tcBorders>
+              <w:top w:val="single" w:color="D9DEE8" w:sz="4"/>
+              <w:left w:val="single" w:color="D9DEE8" w:sz="4"/>
+              <w:bottom w:val="single" w:color="D9DEE8" w:sz="4"/>
+              <w:right w:val="single" w:color="D9DEE8" w:sz="4"/>
+            </w:tcBorders>
+            <w:shd w:fill="FFFFFF" w:color="auto" w:val="clear"/>
+            <w:tcMar>
+              <w:top w:type="dxa" w:w="58"/>
+              <w:left w:type="dxa" w:w="90"/>
+              <w:bottom w:type="dxa" w:w="58"/>
+              <w:right w:type="dxa" w:w="90"/>
+            </w:tcMar>
+          </w:tcPr>
+          <w:p>
+            <w:pPr>
+              <w:spacing w:after="0" w:line="246"/>
+            </w:pPr>
+            <w:r>
+              <w:rPr>
+                <w:rFonts w:ascii="Calibri" w:cs="Calibri" w:eastAsia="Calibri" w:hAnsi="Calibri"/>
+                <w:b w:val="false"/>
+                <w:bCs w:val="false"/>
+                <w:color w:val="24303F"/>
+                <w:sz w:val="13"/>
+                <w:szCs w:val="13"/>
+              </w:rPr>
+              <w:t xml:space="preserve">Social management</w:t>
+            </w:r>
+          </w:p>
+        </w:tc>
+        <w:tc>
+          <w:tcPr>
+            <w:tcW w:type="dxa" w:w="2260"/>
+            <w:tcBorders>
+              <w:top w:val="single" w:color="D9DEE8" w:sz="4"/>
+              <w:left w:val="single" w:color="D9DEE8" w:sz="4"/>
+              <w:bottom w:val="single" w:color="D9DEE8" w:sz="4"/>
+              <w:right w:val="single" w:color="D9DEE8" w:sz="4"/>
+            </w:tcBorders>
+            <w:shd w:fill="FFFFFF" w:color="auto" w:val="clear"/>
+            <w:tcMar>
+              <w:top w:type="dxa" w:w="58"/>
+              <w:left w:type="dxa" w:w="90"/>
+              <w:bottom w:type="dxa" w:w="58"/>
+              <w:right w:type="dxa" w:w="90"/>
+            </w:tcMar>
+          </w:tcPr>
+          <w:p>
+            <w:pPr>
+              <w:spacing w:after="0" w:line="246"/>
+            </w:pPr>
+            <w:r>
+              <w:rPr>
+                <w:rFonts w:ascii="Calibri" w:cs="Calibri" w:eastAsia="Calibri" w:hAnsi="Calibri"/>
+                <w:b w:val="false"/>
+                <w:bCs w:val="false"/>
+                <w:color w:val="24303F"/>
+                <w:sz w:val="13"/>
+                <w:szCs w:val="13"/>
+              </w:rPr>
+              <w:t xml:space="preserve">Full; from ~$299/mo</w:t>
+            </w:r>
+          </w:p>
+        </w:tc>
+        <w:tc>
+          <w:tcPr>
+            <w:tcW w:type="dxa" w:w="3800"/>
+            <w:tcBorders>
+              <w:top w:val="single" w:color="D9DEE8" w:sz="4"/>
+              <w:left w:val="single" w:color="D9DEE8" w:sz="4"/>
+              <w:bottom w:val="single" w:color="D9DEE8" w:sz="4"/>
+              <w:right w:val="single" w:color="D9DEE8" w:sz="4"/>
+            </w:tcBorders>
+            <w:shd w:fill="FFFFFF" w:color="auto" w:val="clear"/>
+            <w:tcMar>
+              <w:top w:type="dxa" w:w="58"/>
+              <w:left w:type="dxa" w:w="90"/>
+              <w:bottom w:type="dxa" w:w="58"/>
+              <w:right w:type="dxa" w:w="90"/>
+            </w:tcMar>
+          </w:tcPr>
+          <w:p>
+            <w:pPr>
+              <w:spacing w:after="0" w:line="246"/>
+            </w:pPr>
+            <w:r>
+              <w:rPr>
+                <w:rFonts w:ascii="Calibri" w:cs="Calibri" w:eastAsia="Calibri" w:hAnsi="Calibri"/>
+                <w:b w:val="false"/>
+                <w:bCs w:val="false"/>
+                <w:color w:val="24303F"/>
+                <w:sz w:val="13"/>
+                <w:szCs w:val="13"/>
+              </w:rPr>
+              <w:t xml:space="preserve">Running many client social accounts</w:t>
+            </w:r>
+          </w:p>
+        </w:tc>
+      </w:tr>
+      <w:tr>
+        <w:tc>
+          <w:tcPr>
+            <w:tcW w:type="dxa" w:w="1550"/>
+            <w:tcBorders>
+              <w:top w:val="single" w:color="D9DEE8" w:sz="4"/>
+              <w:left w:val="single" w:color="D9DEE8" w:sz="4"/>
+              <w:bottom w:val="single" w:color="D9DEE8" w:sz="4"/>
+              <w:right w:val="single" w:color="D9DEE8" w:sz="4"/>
+            </w:tcBorders>
+            <w:shd w:fill="FFFFFF" w:color="auto" w:val="clear"/>
+            <w:tcMar>
+              <w:top w:type="dxa" w:w="58"/>
+              <w:left w:type="dxa" w:w="90"/>
+              <w:bottom w:type="dxa" w:w="58"/>
+              <w:right w:type="dxa" w:w="90"/>
+            </w:tcMar>
+          </w:tcPr>
+          <w:p>
+            <w:pPr>
+              <w:spacing w:after="0" w:line="246"/>
+            </w:pPr>
+            <w:r>
+              <w:rPr>
+                <w:rFonts w:ascii="Calibri" w:cs="Calibri" w:eastAsia="Calibri" w:hAnsi="Calibri"/>
+                <w:b w:val="false"/>
+                <w:bCs w:val="false"/>
+                <w:color w:val="24303F"/>
+                <w:sz w:val="13"/>
+                <w:szCs w:val="13"/>
+              </w:rPr>
+              <w:t xml:space="preserve">SocialPilot</w:t>
+            </w:r>
+          </w:p>
+        </w:tc>
+        <w:tc>
+          <w:tcPr>
+            <w:tcW w:type="dxa" w:w="1750"/>
+            <w:tcBorders>
+              <w:top w:val="single" w:color="D9DEE8" w:sz="4"/>
+              <w:left w:val="single" w:color="D9DEE8" w:sz="4"/>
+              <w:bottom w:val="single" w:color="D9DEE8" w:sz="4"/>
+              <w:right w:val="single" w:color="D9DEE8" w:sz="4"/>
+            </w:tcBorders>
+            <w:shd w:fill="FFFFFF" w:color="auto" w:val="clear"/>
+            <w:tcMar>
+              <w:top w:type="dxa" w:w="58"/>
+              <w:left w:type="dxa" w:w="90"/>
+              <w:bottom w:type="dxa" w:w="58"/>
+              <w:right w:type="dxa" w:w="90"/>
+            </w:tcMar>
+          </w:tcPr>
+          <w:p>
+            <w:pPr>
+              <w:spacing w:after="0" w:line="246"/>
+            </w:pPr>
+            <w:r>
+              <w:rPr>
+                <w:rFonts w:ascii="Calibri" w:cs="Calibri" w:eastAsia="Calibri" w:hAnsi="Calibri"/>
+                <w:b w:val="false"/>
+                <w:bCs w:val="false"/>
+                <w:color w:val="24303F"/>
+                <w:sz w:val="13"/>
+                <w:szCs w:val="13"/>
+              </w:rPr>
+              <w:t xml:space="preserve">Social management</w:t>
+            </w:r>
+          </w:p>
+        </w:tc>
+        <w:tc>
+          <w:tcPr>
+            <w:tcW w:type="dxa" w:w="2260"/>
+            <w:tcBorders>
+              <w:top w:val="single" w:color="D9DEE8" w:sz="4"/>
+              <w:left w:val="single" w:color="D9DEE8" w:sz="4"/>
+              <w:bottom w:val="single" w:color="D9DEE8" w:sz="4"/>
+              <w:right w:val="single" w:color="D9DEE8" w:sz="4"/>
+            </w:tcBorders>
+            <w:shd w:fill="FFFFFF" w:color="auto" w:val="clear"/>
+            <w:tcMar>
+              <w:top w:type="dxa" w:w="58"/>
+              <w:left w:type="dxa" w:w="90"/>
+              <w:bottom w:type="dxa" w:w="58"/>
+              <w:right w:type="dxa" w:w="90"/>
+            </w:tcMar>
+          </w:tcPr>
+          <w:p>
+            <w:pPr>
+              <w:spacing w:after="0" w:line="246"/>
+            </w:pPr>
+            <w:r>
+              <w:rPr>
+                <w:rFonts w:ascii="Calibri" w:cs="Calibri" w:eastAsia="Calibri" w:hAnsi="Calibri"/>
+                <w:b w:val="false"/>
+                <w:bCs w:val="false"/>
+                <w:color w:val="24303F"/>
+                <w:sz w:val="13"/>
+                <w:szCs w:val="13"/>
+              </w:rPr>
+              <w:t xml:space="preserve">Full; from ~$100/mo</w:t>
+            </w:r>
+          </w:p>
+        </w:tc>
+        <w:tc>
+          <w:tcPr>
+            <w:tcW w:type="dxa" w:w="3800"/>
+            <w:tcBorders>
+              <w:top w:val="single" w:color="D9DEE8" w:sz="4"/>
+              <w:left w:val="single" w:color="D9DEE8" w:sz="4"/>
+              <w:bottom w:val="single" w:color="D9DEE8" w:sz="4"/>
+              <w:right w:val="single" w:color="D9DEE8" w:sz="4"/>
+            </w:tcBorders>
+            <w:shd w:fill="FFFFFF" w:color="auto" w:val="clear"/>
+            <w:tcMar>
+              <w:top w:type="dxa" w:w="58"/>
+              <w:left w:type="dxa" w:w="90"/>
+              <w:bottom w:type="dxa" w:w="58"/>
+              <w:right w:type="dxa" w:w="90"/>
+            </w:tcMar>
+          </w:tcPr>
+          <w:p>
+            <w:pPr>
+              <w:spacing w:after="0" w:line="246"/>
+            </w:pPr>
+            <w:r>
+              <w:rPr>
+                <w:rFonts w:ascii="Calibri" w:cs="Calibri" w:eastAsia="Calibri" w:hAnsi="Calibri"/>
+                <w:b w:val="false"/>
+                <w:bCs w:val="false"/>
+                <w:color w:val="24303F"/>
+                <w:sz w:val="13"/>
+                <w:szCs w:val="13"/>
+              </w:rPr>
+              <w:t xml:space="preserve">A cheaper social white-label</w:t>
+            </w:r>
+          </w:p>
+        </w:tc>
+      </w:tr>
+      <w:tr>
+        <w:tc>
+          <w:tcPr>
+            <w:tcW w:type="dxa" w:w="1550"/>
+            <w:tcBorders>
+              <w:top w:val="single" w:color="D9DEE8" w:sz="4"/>
+              <w:left w:val="single" w:color="D9DEE8" w:sz="4"/>
+              <w:bottom w:val="single" w:color="D9DEE8" w:sz="4"/>
+              <w:right w:val="single" w:color="D9DEE8" w:sz="4"/>
+            </w:tcBorders>
+            <w:shd w:fill="FFFFFF" w:color="auto" w:val="clear"/>
+            <w:tcMar>
+              <w:top w:type="dxa" w:w="58"/>
+              <w:left w:type="dxa" w:w="90"/>
+              <w:bottom w:type="dxa" w:w="58"/>
+              <w:right w:type="dxa" w:w="90"/>
+            </w:tcMar>
+          </w:tcPr>
+          <w:p>
+            <w:pPr>
+              <w:spacing w:after="0" w:line="246"/>
+            </w:pPr>
+            <w:r>
+              <w:rPr>
+                <w:rFonts w:ascii="Calibri" w:cs="Calibri" w:eastAsia="Calibri" w:hAnsi="Calibri"/>
+                <w:b w:val="false"/>
+                <w:bCs w:val="false"/>
+                <w:color w:val="24303F"/>
+                <w:sz w:val="13"/>
+                <w:szCs w:val="13"/>
+              </w:rPr>
+              <w:t xml:space="preserve">Trillet</w:t>
+            </w:r>
+          </w:p>
+        </w:tc>
+        <w:tc>
+          <w:tcPr>
+            <w:tcW w:type="dxa" w:w="1750"/>
+            <w:tcBorders>
+              <w:top w:val="single" w:color="D9DEE8" w:sz="4"/>
+              <w:left w:val="single" w:color="D9DEE8" w:sz="4"/>
+              <w:bottom w:val="single" w:color="D9DEE8" w:sz="4"/>
+              <w:right w:val="single" w:color="D9DEE8" w:sz="4"/>
+            </w:tcBorders>
+            <w:shd w:fill="FFFFFF" w:color="auto" w:val="clear"/>
+            <w:tcMar>
+              <w:top w:type="dxa" w:w="58"/>
+              <w:left w:type="dxa" w:w="90"/>
+              <w:bottom w:type="dxa" w:w="58"/>
+              <w:right w:type="dxa" w:w="90"/>
+            </w:tcMar>
+          </w:tcPr>
+          <w:p>
+            <w:pPr>
+              <w:spacing w:after="0" w:line="246"/>
+            </w:pPr>
+            <w:r>
+              <w:rPr>
+                <w:rFonts w:ascii="Calibri" w:cs="Calibri" w:eastAsia="Calibri" w:hAnsi="Calibri"/>
+                <w:b w:val="false"/>
+                <w:bCs w:val="false"/>
+                <w:color w:val="24303F"/>
+                <w:sz w:val="13"/>
+                <w:szCs w:val="13"/>
+              </w:rPr>
               <w:t xml:space="preserve">Voice AI</w:t>
             </w:r>
           </w:p>
         </w:tc>
         <w:tc>
           <w:tcPr>
-            <w:tcW w:type="dxa" w:w="2500"/>
-            <w:tcBorders>
-              <w:top w:val="single" w:color="D9DEE8" w:sz="4"/>
-              <w:left w:val="single" w:color="D9DEE8" w:sz="4"/>
-              <w:bottom w:val="single" w:color="D9DEE8" w:sz="4"/>
-              <w:right w:val="single" w:color="D9DEE8" w:sz="4"/>
-            </w:tcBorders>
-            <w:shd w:fill="FFFFFF" w:color="auto" w:val="clear"/>
-            <w:tcMar>
-              <w:top w:type="dxa" w:w="58"/>
-              <w:left w:type="dxa" w:w="90"/>
-              <w:bottom w:type="dxa" w:w="58"/>
-              <w:right w:type="dxa" w:w="90"/>
-            </w:tcMar>
-          </w:tcPr>
-          <w:p>
-            <w:pPr>
-              <w:spacing w:after="0" w:line="246"/>
-            </w:pPr>
-            <w:r>
-              <w:rPr>
-                <w:rFonts w:ascii="Calibri" w:cs="Calibri" w:eastAsia="Calibri" w:hAnsi="Calibri"/>
-                <w:b w:val="false"/>
-                <w:bCs w:val="false"/>
-                <w:color w:val="24303F"/>
-                <w:sz w:val="13"/>
-                <w:szCs w:val="13"/>
-              </w:rPr>
-              <w:t xml:space="preserve">Branded AI phone agents that answer and book (Trillet, Synthflow, others)</w:t>
-            </w:r>
-          </w:p>
-        </w:tc>
-        <w:tc>
-          <w:tcPr>
-            <w:tcW w:type="dxa" w:w="2600"/>
-            <w:tcBorders>
-              <w:top w:val="single" w:color="D9DEE8" w:sz="4"/>
-              <w:left w:val="single" w:color="D9DEE8" w:sz="4"/>
-              <w:bottom w:val="single" w:color="D9DEE8" w:sz="4"/>
-              <w:right w:val="single" w:color="D9DEE8" w:sz="4"/>
-            </w:tcBorders>
-            <w:shd w:fill="FFFFFF" w:color="auto" w:val="clear"/>
-            <w:tcMar>
-              <w:top w:type="dxa" w:w="58"/>
-              <w:left w:type="dxa" w:w="90"/>
-              <w:bottom w:type="dxa" w:w="58"/>
-              <w:right w:type="dxa" w:w="90"/>
-            </w:tcMar>
-          </w:tcPr>
-          <w:p>
-            <w:pPr>
-              <w:spacing w:after="0" w:line="246"/>
-            </w:pPr>
-            <w:r>
-              <w:rPr>
-                <w:rFonts w:ascii="Calibri" w:cs="Calibri" w:eastAsia="Calibri" w:hAnsi="Calibri"/>
-                <w:b w:val="false"/>
-                <w:bCs w:val="false"/>
-                <w:color w:val="24303F"/>
-                <w:sz w:val="13"/>
-                <w:szCs w:val="13"/>
-              </w:rPr>
-              <w:t xml:space="preserve">Highest stickiness and value; a missed call is money</w:t>
-            </w:r>
-          </w:p>
-        </w:tc>
-        <w:tc>
-          <w:tcPr>
-            <w:tcW w:type="dxa" w:w="2510"/>
-            <w:tcBorders>
-              <w:top w:val="single" w:color="D9DEE8" w:sz="4"/>
-              <w:left w:val="single" w:color="D9DEE8" w:sz="4"/>
-              <w:bottom w:val="single" w:color="D9DEE8" w:sz="4"/>
-              <w:right w:val="single" w:color="D9DEE8" w:sz="4"/>
-            </w:tcBorders>
-            <w:shd w:fill="FFFFFF" w:color="auto" w:val="clear"/>
-            <w:tcMar>
-              <w:top w:type="dxa" w:w="58"/>
-              <w:left w:type="dxa" w:w="90"/>
-              <w:bottom w:type="dxa" w:w="58"/>
-              <w:right w:type="dxa" w:w="90"/>
-            </w:tcMar>
-          </w:tcPr>
-          <w:p>
-            <w:pPr>
-              <w:spacing w:after="0" w:line="246"/>
-            </w:pPr>
-            <w:r>
-              <w:rPr>
-                <w:rFonts w:ascii="Calibri" w:cs="Calibri" w:eastAsia="Calibri" w:hAnsi="Calibri"/>
-                <w:b w:val="false"/>
-                <w:bCs w:val="false"/>
-                <w:color w:val="24303F"/>
-                <w:sz w:val="13"/>
-                <w:szCs w:val="13"/>
-              </w:rPr>
-              <w:t xml:space="preserve">Compliance and call quality vary widely; check both</w:t>
+            <w:tcW w:type="dxa" w:w="2260"/>
+            <w:tcBorders>
+              <w:top w:val="single" w:color="D9DEE8" w:sz="4"/>
+              <w:left w:val="single" w:color="D9DEE8" w:sz="4"/>
+              <w:bottom w:val="single" w:color="D9DEE8" w:sz="4"/>
+              <w:right w:val="single" w:color="D9DEE8" w:sz="4"/>
+            </w:tcBorders>
+            <w:shd w:fill="FFFFFF" w:color="auto" w:val="clear"/>
+            <w:tcMar>
+              <w:top w:type="dxa" w:w="58"/>
+              <w:left w:type="dxa" w:w="90"/>
+              <w:bottom w:type="dxa" w:w="58"/>
+              <w:right w:type="dxa" w:w="90"/>
+            </w:tcMar>
+          </w:tcPr>
+          <w:p>
+            <w:pPr>
+              <w:spacing w:after="0" w:line="246"/>
+            </w:pPr>
+            <w:r>
+              <w:rPr>
+                <w:rFonts w:ascii="Calibri" w:cs="Calibri" w:eastAsia="Calibri" w:hAnsi="Calibri"/>
+                <w:b w:val="false"/>
+                <w:bCs w:val="false"/>
+                <w:color w:val="24303F"/>
+                <w:sz w:val="13"/>
+                <w:szCs w:val="13"/>
+              </w:rPr>
+              <w:t xml:space="preserve">Full; compliance built in</w:t>
+            </w:r>
+          </w:p>
+        </w:tc>
+        <w:tc>
+          <w:tcPr>
+            <w:tcW w:type="dxa" w:w="3800"/>
+            <w:tcBorders>
+              <w:top w:val="single" w:color="D9DEE8" w:sz="4"/>
+              <w:left w:val="single" w:color="D9DEE8" w:sz="4"/>
+              <w:bottom w:val="single" w:color="D9DEE8" w:sz="4"/>
+              <w:right w:val="single" w:color="D9DEE8" w:sz="4"/>
+            </w:tcBorders>
+            <w:shd w:fill="FFFFFF" w:color="auto" w:val="clear"/>
+            <w:tcMar>
+              <w:top w:type="dxa" w:w="58"/>
+              <w:left w:type="dxa" w:w="90"/>
+              <w:bottom w:type="dxa" w:w="58"/>
+              <w:right w:type="dxa" w:w="90"/>
+            </w:tcMar>
+          </w:tcPr>
+          <w:p>
+            <w:pPr>
+              <w:spacing w:after="0" w:line="246"/>
+            </w:pPr>
+            <w:r>
+              <w:rPr>
+                <w:rFonts w:ascii="Calibri" w:cs="Calibri" w:eastAsia="Calibri" w:hAnsi="Calibri"/>
+                <w:b w:val="false"/>
+                <w:bCs w:val="false"/>
+                <w:color w:val="24303F"/>
+                <w:sz w:val="13"/>
+                <w:szCs w:val="13"/>
+              </w:rPr>
+              <w:t xml:space="preserve">Phone-heavy or regulated clients (this is us)</w:t>
+            </w:r>
+          </w:p>
+        </w:tc>
+      </w:tr>
+      <w:tr>
+        <w:tc>
+          <w:tcPr>
+            <w:tcW w:type="dxa" w:w="1550"/>
+            <w:tcBorders>
+              <w:top w:val="single" w:color="D9DEE8" w:sz="4"/>
+              <w:left w:val="single" w:color="D9DEE8" w:sz="4"/>
+              <w:bottom w:val="single" w:color="D9DEE8" w:sz="4"/>
+              <w:right w:val="single" w:color="D9DEE8" w:sz="4"/>
+            </w:tcBorders>
+            <w:shd w:fill="FFFFFF" w:color="auto" w:val="clear"/>
+            <w:tcMar>
+              <w:top w:type="dxa" w:w="58"/>
+              <w:left w:type="dxa" w:w="90"/>
+              <w:bottom w:type="dxa" w:w="58"/>
+              <w:right w:type="dxa" w:w="90"/>
+            </w:tcMar>
+          </w:tcPr>
+          <w:p>
+            <w:pPr>
+              <w:spacing w:after="0" w:line="246"/>
+            </w:pPr>
+            <w:r>
+              <w:rPr>
+                <w:rFonts w:ascii="Calibri" w:cs="Calibri" w:eastAsia="Calibri" w:hAnsi="Calibri"/>
+                <w:b w:val="false"/>
+                <w:bCs w:val="false"/>
+                <w:color w:val="24303F"/>
+                <w:sz w:val="13"/>
+                <w:szCs w:val="13"/>
+              </w:rPr>
+              <w:t xml:space="preserve">Synthflow</w:t>
+            </w:r>
+          </w:p>
+        </w:tc>
+        <w:tc>
+          <w:tcPr>
+            <w:tcW w:type="dxa" w:w="1750"/>
+            <w:tcBorders>
+              <w:top w:val="single" w:color="D9DEE8" w:sz="4"/>
+              <w:left w:val="single" w:color="D9DEE8" w:sz="4"/>
+              <w:bottom w:val="single" w:color="D9DEE8" w:sz="4"/>
+              <w:right w:val="single" w:color="D9DEE8" w:sz="4"/>
+            </w:tcBorders>
+            <w:shd w:fill="FFFFFF" w:color="auto" w:val="clear"/>
+            <w:tcMar>
+              <w:top w:type="dxa" w:w="58"/>
+              <w:left w:type="dxa" w:w="90"/>
+              <w:bottom w:type="dxa" w:w="58"/>
+              <w:right w:type="dxa" w:w="90"/>
+            </w:tcMar>
+          </w:tcPr>
+          <w:p>
+            <w:pPr>
+              <w:spacing w:after="0" w:line="246"/>
+            </w:pPr>
+            <w:r>
+              <w:rPr>
+                <w:rFonts w:ascii="Calibri" w:cs="Calibri" w:eastAsia="Calibri" w:hAnsi="Calibri"/>
+                <w:b w:val="false"/>
+                <w:bCs w:val="false"/>
+                <w:color w:val="24303F"/>
+                <w:sz w:val="13"/>
+                <w:szCs w:val="13"/>
+              </w:rPr>
+              <w:t xml:space="preserve">Voice AI (no-code)</w:t>
+            </w:r>
+          </w:p>
+        </w:tc>
+        <w:tc>
+          <w:tcPr>
+            <w:tcW w:type="dxa" w:w="2260"/>
+            <w:tcBorders>
+              <w:top w:val="single" w:color="D9DEE8" w:sz="4"/>
+              <w:left w:val="single" w:color="D9DEE8" w:sz="4"/>
+              <w:bottom w:val="single" w:color="D9DEE8" w:sz="4"/>
+              <w:right w:val="single" w:color="D9DEE8" w:sz="4"/>
+            </w:tcBorders>
+            <w:shd w:fill="FFFFFF" w:color="auto" w:val="clear"/>
+            <w:tcMar>
+              <w:top w:type="dxa" w:w="58"/>
+              <w:left w:type="dxa" w:w="90"/>
+              <w:bottom w:type="dxa" w:w="58"/>
+              <w:right w:type="dxa" w:w="90"/>
+            </w:tcMar>
+          </w:tcPr>
+          <w:p>
+            <w:pPr>
+              <w:spacing w:after="0" w:line="246"/>
+            </w:pPr>
+            <w:r>
+              <w:rPr>
+                <w:rFonts w:ascii="Calibri" w:cs="Calibri" w:eastAsia="Calibri" w:hAnsi="Calibri"/>
+                <w:b w:val="false"/>
+                <w:bCs w:val="false"/>
+                <w:color w:val="24303F"/>
+                <w:sz w:val="13"/>
+                <w:szCs w:val="13"/>
+              </w:rPr>
+              <w:t xml:space="preserve">White-label on a higher tier</w:t>
+            </w:r>
+          </w:p>
+        </w:tc>
+        <w:tc>
+          <w:tcPr>
+            <w:tcW w:type="dxa" w:w="3800"/>
+            <w:tcBorders>
+              <w:top w:val="single" w:color="D9DEE8" w:sz="4"/>
+              <w:left w:val="single" w:color="D9DEE8" w:sz="4"/>
+              <w:bottom w:val="single" w:color="D9DEE8" w:sz="4"/>
+              <w:right w:val="single" w:color="D9DEE8" w:sz="4"/>
+            </w:tcBorders>
+            <w:shd w:fill="FFFFFF" w:color="auto" w:val="clear"/>
+            <w:tcMar>
+              <w:top w:type="dxa" w:w="58"/>
+              <w:left w:type="dxa" w:w="90"/>
+              <w:bottom w:type="dxa" w:w="58"/>
+              <w:right w:type="dxa" w:w="90"/>
+            </w:tcMar>
+          </w:tcPr>
+          <w:p>
+            <w:pPr>
+              <w:spacing w:after="0" w:line="246"/>
+            </w:pPr>
+            <w:r>
+              <w:rPr>
+                <w:rFonts w:ascii="Calibri" w:cs="Calibri" w:eastAsia="Calibri" w:hAnsi="Calibri"/>
+                <w:b w:val="false"/>
+                <w:bCs w:val="false"/>
+                <w:color w:val="24303F"/>
+                <w:sz w:val="13"/>
+                <w:szCs w:val="13"/>
+              </w:rPr>
+              <w:t xml:space="preserve">Building voice flows visually</w:t>
+            </w:r>
+          </w:p>
+        </w:tc>
+      </w:tr>
+      <w:tr>
+        <w:tc>
+          <w:tcPr>
+            <w:tcW w:type="dxa" w:w="1550"/>
+            <w:tcBorders>
+              <w:top w:val="single" w:color="D9DEE8" w:sz="4"/>
+              <w:left w:val="single" w:color="D9DEE8" w:sz="4"/>
+              <w:bottom w:val="single" w:color="D9DEE8" w:sz="4"/>
+              <w:right w:val="single" w:color="D9DEE8" w:sz="4"/>
+            </w:tcBorders>
+            <w:shd w:fill="FFFFFF" w:color="auto" w:val="clear"/>
+            <w:tcMar>
+              <w:top w:type="dxa" w:w="58"/>
+              <w:left w:type="dxa" w:w="90"/>
+              <w:bottom w:type="dxa" w:w="58"/>
+              <w:right w:type="dxa" w:w="90"/>
+            </w:tcMar>
+          </w:tcPr>
+          <w:p>
+            <w:pPr>
+              <w:spacing w:after="0" w:line="246"/>
+            </w:pPr>
+            <w:r>
+              <w:rPr>
+                <w:rFonts w:ascii="Calibri" w:cs="Calibri" w:eastAsia="Calibri" w:hAnsi="Calibri"/>
+                <w:b w:val="false"/>
+                <w:bCs w:val="false"/>
+                <w:color w:val="24303F"/>
+                <w:sz w:val="13"/>
+                <w:szCs w:val="13"/>
+              </w:rPr>
+              <w:t xml:space="preserve">Autocalls</w:t>
+            </w:r>
+          </w:p>
+        </w:tc>
+        <w:tc>
+          <w:tcPr>
+            <w:tcW w:type="dxa" w:w="1750"/>
+            <w:tcBorders>
+              <w:top w:val="single" w:color="D9DEE8" w:sz="4"/>
+              <w:left w:val="single" w:color="D9DEE8" w:sz="4"/>
+              <w:bottom w:val="single" w:color="D9DEE8" w:sz="4"/>
+              <w:right w:val="single" w:color="D9DEE8" w:sz="4"/>
+            </w:tcBorders>
+            <w:shd w:fill="FFFFFF" w:color="auto" w:val="clear"/>
+            <w:tcMar>
+              <w:top w:type="dxa" w:w="58"/>
+              <w:left w:type="dxa" w:w="90"/>
+              <w:bottom w:type="dxa" w:w="58"/>
+              <w:right w:type="dxa" w:w="90"/>
+            </w:tcMar>
+          </w:tcPr>
+          <w:p>
+            <w:pPr>
+              <w:spacing w:after="0" w:line="246"/>
+            </w:pPr>
+            <w:r>
+              <w:rPr>
+                <w:rFonts w:ascii="Calibri" w:cs="Calibri" w:eastAsia="Calibri" w:hAnsi="Calibri"/>
+                <w:b w:val="false"/>
+                <w:bCs w:val="false"/>
+                <w:color w:val="24303F"/>
+                <w:sz w:val="13"/>
+                <w:szCs w:val="13"/>
+              </w:rPr>
+              <w:t xml:space="preserve">Voice AI (multi-channel)</w:t>
+            </w:r>
+          </w:p>
+        </w:tc>
+        <w:tc>
+          <w:tcPr>
+            <w:tcW w:type="dxa" w:w="2260"/>
+            <w:tcBorders>
+              <w:top w:val="single" w:color="D9DEE8" w:sz="4"/>
+              <w:left w:val="single" w:color="D9DEE8" w:sz="4"/>
+              <w:bottom w:val="single" w:color="D9DEE8" w:sz="4"/>
+              <w:right w:val="single" w:color="D9DEE8" w:sz="4"/>
+            </w:tcBorders>
+            <w:shd w:fill="FFFFFF" w:color="auto" w:val="clear"/>
+            <w:tcMar>
+              <w:top w:type="dxa" w:w="58"/>
+              <w:left w:type="dxa" w:w="90"/>
+              <w:bottom w:type="dxa" w:w="58"/>
+              <w:right w:type="dxa" w:w="90"/>
+            </w:tcMar>
+          </w:tcPr>
+          <w:p>
+            <w:pPr>
+              <w:spacing w:after="0" w:line="246"/>
+            </w:pPr>
+            <w:r>
+              <w:rPr>
+                <w:rFonts w:ascii="Calibri" w:cs="Calibri" w:eastAsia="Calibri" w:hAnsi="Calibri"/>
+                <w:b w:val="false"/>
+                <w:bCs w:val="false"/>
+                <w:color w:val="24303F"/>
+                <w:sz w:val="13"/>
+                <w:szCs w:val="13"/>
+              </w:rPr>
+              <w:t xml:space="preserve">Full; ~$419/mo, unlimited sub-accounts</w:t>
+            </w:r>
+          </w:p>
+        </w:tc>
+        <w:tc>
+          <w:tcPr>
+            <w:tcW w:type="dxa" w:w="3800"/>
+            <w:tcBorders>
+              <w:top w:val="single" w:color="D9DEE8" w:sz="4"/>
+              <w:left w:val="single" w:color="D9DEE8" w:sz="4"/>
+              <w:bottom w:val="single" w:color="D9DEE8" w:sz="4"/>
+              <w:right w:val="single" w:color="D9DEE8" w:sz="4"/>
+            </w:tcBorders>
+            <w:shd w:fill="FFFFFF" w:color="auto" w:val="clear"/>
+            <w:tcMar>
+              <w:top w:type="dxa" w:w="58"/>
+              <w:left w:type="dxa" w:w="90"/>
+              <w:bottom w:type="dxa" w:w="58"/>
+              <w:right w:type="dxa" w:w="90"/>
+            </w:tcMar>
+          </w:tcPr>
+          <w:p>
+            <w:pPr>
+              <w:spacing w:after="0" w:line="246"/>
+            </w:pPr>
+            <w:r>
+              <w:rPr>
+                <w:rFonts w:ascii="Calibri" w:cs="Calibri" w:eastAsia="Calibri" w:hAnsi="Calibri"/>
+                <w:b w:val="false"/>
+                <w:bCs w:val="false"/>
+                <w:color w:val="24303F"/>
+                <w:sz w:val="13"/>
+                <w:szCs w:val="13"/>
+              </w:rPr>
+              <w:t xml:space="preserve">Fast, cheap, multi-channel launch</w:t>
+            </w:r>
+          </w:p>
+        </w:tc>
+      </w:tr>
+      <w:tr>
+        <w:tc>
+          <w:tcPr>
+            <w:tcW w:type="dxa" w:w="1550"/>
+            <w:tcBorders>
+              <w:top w:val="single" w:color="D9DEE8" w:sz="4"/>
+              <w:left w:val="single" w:color="D9DEE8" w:sz="4"/>
+              <w:bottom w:val="single" w:color="D9DEE8" w:sz="4"/>
+              <w:right w:val="single" w:color="D9DEE8" w:sz="4"/>
+            </w:tcBorders>
+            <w:shd w:fill="FFFFFF" w:color="auto" w:val="clear"/>
+            <w:tcMar>
+              <w:top w:type="dxa" w:w="58"/>
+              <w:left w:type="dxa" w:w="90"/>
+              <w:bottom w:type="dxa" w:w="58"/>
+              <w:right w:type="dxa" w:w="90"/>
+            </w:tcMar>
+          </w:tcPr>
+          <w:p>
+            <w:pPr>
+              <w:spacing w:after="0" w:line="246"/>
+            </w:pPr>
+            <w:r>
+              <w:rPr>
+                <w:rFonts w:ascii="Calibri" w:cs="Calibri" w:eastAsia="Calibri" w:hAnsi="Calibri"/>
+                <w:b w:val="false"/>
+                <w:bCs w:val="false"/>
+                <w:color w:val="24303F"/>
+                <w:sz w:val="13"/>
+                <w:szCs w:val="13"/>
+              </w:rPr>
+              <w:t xml:space="preserve">VoiceAIWrapper</w:t>
+            </w:r>
+          </w:p>
+        </w:tc>
+        <w:tc>
+          <w:tcPr>
+            <w:tcW w:type="dxa" w:w="1750"/>
+            <w:tcBorders>
+              <w:top w:val="single" w:color="D9DEE8" w:sz="4"/>
+              <w:left w:val="single" w:color="D9DEE8" w:sz="4"/>
+              <w:bottom w:val="single" w:color="D9DEE8" w:sz="4"/>
+              <w:right w:val="single" w:color="D9DEE8" w:sz="4"/>
+            </w:tcBorders>
+            <w:shd w:fill="FFFFFF" w:color="auto" w:val="clear"/>
+            <w:tcMar>
+              <w:top w:type="dxa" w:w="58"/>
+              <w:left w:type="dxa" w:w="90"/>
+              <w:bottom w:type="dxa" w:w="58"/>
+              <w:right w:type="dxa" w:w="90"/>
+            </w:tcMar>
+          </w:tcPr>
+          <w:p>
+            <w:pPr>
+              <w:spacing w:after="0" w:line="246"/>
+            </w:pPr>
+            <w:r>
+              <w:rPr>
+                <w:rFonts w:ascii="Calibri" w:cs="Calibri" w:eastAsia="Calibri" w:hAnsi="Calibri"/>
+                <w:b w:val="false"/>
+                <w:bCs w:val="false"/>
+                <w:color w:val="24303F"/>
+                <w:sz w:val="13"/>
+                <w:szCs w:val="13"/>
+              </w:rPr>
+              <w:t xml:space="preserve">Voice AI (wrapper)</w:t>
+            </w:r>
+          </w:p>
+        </w:tc>
+        <w:tc>
+          <w:tcPr>
+            <w:tcW w:type="dxa" w:w="2260"/>
+            <w:tcBorders>
+              <w:top w:val="single" w:color="D9DEE8" w:sz="4"/>
+              <w:left w:val="single" w:color="D9DEE8" w:sz="4"/>
+              <w:bottom w:val="single" w:color="D9DEE8" w:sz="4"/>
+              <w:right w:val="single" w:color="D9DEE8" w:sz="4"/>
+            </w:tcBorders>
+            <w:shd w:fill="FFFFFF" w:color="auto" w:val="clear"/>
+            <w:tcMar>
+              <w:top w:type="dxa" w:w="58"/>
+              <w:left w:type="dxa" w:w="90"/>
+              <w:bottom w:type="dxa" w:w="58"/>
+              <w:right w:type="dxa" w:w="90"/>
+            </w:tcMar>
+          </w:tcPr>
+          <w:p>
+            <w:pPr>
+              <w:spacing w:after="0" w:line="246"/>
+            </w:pPr>
+            <w:r>
+              <w:rPr>
+                <w:rFonts w:ascii="Calibri" w:cs="Calibri" w:eastAsia="Calibri" w:hAnsi="Calibri"/>
+                <w:b w:val="false"/>
+                <w:bCs w:val="false"/>
+                <w:color w:val="24303F"/>
+                <w:sz w:val="13"/>
+                <w:szCs w:val="13"/>
+              </w:rPr>
+              <w:t xml:space="preserve">Full</w:t>
+            </w:r>
+          </w:p>
+        </w:tc>
+        <w:tc>
+          <w:tcPr>
+            <w:tcW w:type="dxa" w:w="3800"/>
+            <w:tcBorders>
+              <w:top w:val="single" w:color="D9DEE8" w:sz="4"/>
+              <w:left w:val="single" w:color="D9DEE8" w:sz="4"/>
+              <w:bottom w:val="single" w:color="D9DEE8" w:sz="4"/>
+              <w:right w:val="single" w:color="D9DEE8" w:sz="4"/>
+            </w:tcBorders>
+            <w:shd w:fill="FFFFFF" w:color="auto" w:val="clear"/>
+            <w:tcMar>
+              <w:top w:type="dxa" w:w="58"/>
+              <w:left w:type="dxa" w:w="90"/>
+              <w:bottom w:type="dxa" w:w="58"/>
+              <w:right w:type="dxa" w:w="90"/>
+            </w:tcMar>
+          </w:tcPr>
+          <w:p>
+            <w:pPr>
+              <w:spacing w:after="0" w:line="246"/>
+            </w:pPr>
+            <w:r>
+              <w:rPr>
+                <w:rFonts w:ascii="Calibri" w:cs="Calibri" w:eastAsia="Calibri" w:hAnsi="Calibri"/>
+                <w:b w:val="false"/>
+                <w:bCs w:val="false"/>
+                <w:color w:val="24303F"/>
+                <w:sz w:val="13"/>
+                <w:szCs w:val="13"/>
+              </w:rPr>
+              <w:t xml:space="preserve">Reselling Vapi or Retell under your brand</w:t>
+            </w:r>
+          </w:p>
+        </w:tc>
+      </w:tr>
+      <w:tr>
+        <w:tc>
+          <w:tcPr>
+            <w:tcW w:type="dxa" w:w="1550"/>
+            <w:tcBorders>
+              <w:top w:val="single" w:color="D9DEE8" w:sz="4"/>
+              <w:left w:val="single" w:color="D9DEE8" w:sz="4"/>
+              <w:bottom w:val="single" w:color="D9DEE8" w:sz="4"/>
+              <w:right w:val="single" w:color="D9DEE8" w:sz="4"/>
+            </w:tcBorders>
+            <w:shd w:fill="FFFFFF" w:color="auto" w:val="clear"/>
+            <w:tcMar>
+              <w:top w:type="dxa" w:w="58"/>
+              <w:left w:type="dxa" w:w="90"/>
+              <w:bottom w:type="dxa" w:w="58"/>
+              <w:right w:type="dxa" w:w="90"/>
+            </w:tcMar>
+          </w:tcPr>
+          <w:p>
+            <w:pPr>
+              <w:spacing w:after="0" w:line="246"/>
+            </w:pPr>
+            <w:r>
+              <w:rPr>
+                <w:rFonts w:ascii="Calibri" w:cs="Calibri" w:eastAsia="Calibri" w:hAnsi="Calibri"/>
+                <w:b w:val="false"/>
+                <w:bCs w:val="false"/>
+                <w:color w:val="24303F"/>
+                <w:sz w:val="13"/>
+                <w:szCs w:val="13"/>
+              </w:rPr>
+              <w:t xml:space="preserve">Stammer</w:t>
+            </w:r>
+          </w:p>
+        </w:tc>
+        <w:tc>
+          <w:tcPr>
+            <w:tcW w:type="dxa" w:w="1750"/>
+            <w:tcBorders>
+              <w:top w:val="single" w:color="D9DEE8" w:sz="4"/>
+              <w:left w:val="single" w:color="D9DEE8" w:sz="4"/>
+              <w:bottom w:val="single" w:color="D9DEE8" w:sz="4"/>
+              <w:right w:val="single" w:color="D9DEE8" w:sz="4"/>
+            </w:tcBorders>
+            <w:shd w:fill="FFFFFF" w:color="auto" w:val="clear"/>
+            <w:tcMar>
+              <w:top w:type="dxa" w:w="58"/>
+              <w:left w:type="dxa" w:w="90"/>
+              <w:bottom w:type="dxa" w:w="58"/>
+              <w:right w:type="dxa" w:w="90"/>
+            </w:tcMar>
+          </w:tcPr>
+          <w:p>
+            <w:pPr>
+              <w:spacing w:after="0" w:line="246"/>
+            </w:pPr>
+            <w:r>
+              <w:rPr>
+                <w:rFonts w:ascii="Calibri" w:cs="Calibri" w:eastAsia="Calibri" w:hAnsi="Calibri"/>
+                <w:b w:val="false"/>
+                <w:bCs w:val="false"/>
+                <w:color w:val="24303F"/>
+                <w:sz w:val="13"/>
+                <w:szCs w:val="13"/>
+              </w:rPr>
+              <w:t xml:space="preserve">Chat + voice</w:t>
+            </w:r>
+          </w:p>
+        </w:tc>
+        <w:tc>
+          <w:tcPr>
+            <w:tcW w:type="dxa" w:w="2260"/>
+            <w:tcBorders>
+              <w:top w:val="single" w:color="D9DEE8" w:sz="4"/>
+              <w:left w:val="single" w:color="D9DEE8" w:sz="4"/>
+              <w:bottom w:val="single" w:color="D9DEE8" w:sz="4"/>
+              <w:right w:val="single" w:color="D9DEE8" w:sz="4"/>
+            </w:tcBorders>
+            <w:shd w:fill="FFFFFF" w:color="auto" w:val="clear"/>
+            <w:tcMar>
+              <w:top w:type="dxa" w:w="58"/>
+              <w:left w:type="dxa" w:w="90"/>
+              <w:bottom w:type="dxa" w:w="58"/>
+              <w:right w:type="dxa" w:w="90"/>
+            </w:tcMar>
+          </w:tcPr>
+          <w:p>
+            <w:pPr>
+              <w:spacing w:after="0" w:line="246"/>
+            </w:pPr>
+            <w:r>
+              <w:rPr>
+                <w:rFonts w:ascii="Calibri" w:cs="Calibri" w:eastAsia="Calibri" w:hAnsi="Calibri"/>
+                <w:b w:val="false"/>
+                <w:bCs w:val="false"/>
+                <w:color w:val="24303F"/>
+                <w:sz w:val="13"/>
+                <w:szCs w:val="13"/>
+              </w:rPr>
+              <w:t xml:space="preserve">Full; GDPR only, no HIPAA</w:t>
+            </w:r>
+          </w:p>
+        </w:tc>
+        <w:tc>
+          <w:tcPr>
+            <w:tcW w:type="dxa" w:w="3800"/>
+            <w:tcBorders>
+              <w:top w:val="single" w:color="D9DEE8" w:sz="4"/>
+              <w:left w:val="single" w:color="D9DEE8" w:sz="4"/>
+              <w:bottom w:val="single" w:color="D9DEE8" w:sz="4"/>
+              <w:right w:val="single" w:color="D9DEE8" w:sz="4"/>
+            </w:tcBorders>
+            <w:shd w:fill="FFFFFF" w:color="auto" w:val="clear"/>
+            <w:tcMar>
+              <w:top w:type="dxa" w:w="58"/>
+              <w:left w:type="dxa" w:w="90"/>
+              <w:bottom w:type="dxa" w:w="58"/>
+              <w:right w:type="dxa" w:w="90"/>
+            </w:tcMar>
+          </w:tcPr>
+          <w:p>
+            <w:pPr>
+              <w:spacing w:after="0" w:line="246"/>
+            </w:pPr>
+            <w:r>
+              <w:rPr>
+                <w:rFonts w:ascii="Calibri" w:cs="Calibri" w:eastAsia="Calibri" w:hAnsi="Calibri"/>
+                <w:b w:val="false"/>
+                <w:bCs w:val="false"/>
+                <w:color w:val="24303F"/>
+                <w:sz w:val="13"/>
+                <w:szCs w:val="13"/>
+              </w:rPr>
+              <w:t xml:space="preserve">Agencies leading with chat</w:t>
             </w:r>
           </w:p>
         </w:tc>
@@ -1579,7 +2572,23 @@
           <w:sz w:val="25"/>
           <w:szCs w:val="25"/>
         </w:rPr>
-        <w:t xml:space="preserve">Why voice AI is the category I would lead with</w:t>
+        <w:t xml:space="preserve">The categories, and who leads each</w:t>
+      </w:r>
+    </w:p>
+    <w:p>
+      <w:pPr>
+        <w:spacing w:after="16" w:before="90"/>
+      </w:pPr>
+      <w:r>
+        <w:rPr>
+          <w:rFonts w:ascii="Calibri" w:cs="Calibri" w:eastAsia="Calibri" w:hAnsi="Calibri"/>
+          <w:b/>
+          <w:bCs/>
+          <w:color w:val="16223C"/>
+          <w:sz w:val="20"/>
+          <w:szCs w:val="20"/>
+        </w:rPr>
+        <w:t xml:space="preserve">All-in-one agency suites: GoHighLevel and Vendasta</w:t>
       </w:r>
     </w:p>
     <w:p>
@@ -1597,7 +2606,23 @@
           <w:sz w:val="20"/>
           <w:szCs w:val="20"/>
         </w:rPr>
-        <w:t xml:space="preserve">If I were rebuilding that agency today, voice AI is where I would start, and not because I now build it. It is the stickiest software an agency can resell. A client feels a missed call the same day, in lost bookings and lost revenue, so an AI that answers every call is something they notice working and are slow to cancel. It also sits upstream of everything else you sell, because the call is where the customer relationship starts.</w:t>
+        <w:t xml:space="preserve">If you want one platform to run most of an agency, these two lead. GoHighLevel bundles CRM, funnels, email, booking and a growing set of AI features, all fully white-label, though HIPAA is a paid add-on rather than standard. Vendasta is more of a marketplace, letting you resell a broad catalogue of digital services under your brand, with SOC 2 Type II behind it. Both are sticky once a client runs their business on them, but you are reselling a whole platform, not a focused tool.</w:t>
+      </w:r>
+    </w:p>
+    <w:p>
+      <w:pPr>
+        <w:spacing w:after="16" w:before="90"/>
+      </w:pPr>
+      <w:r>
+        <w:rPr>
+          <w:rFonts w:ascii="Calibri" w:cs="Calibri" w:eastAsia="Calibri" w:hAnsi="Calibri"/>
+          <w:b/>
+          <w:bCs/>
+          <w:color w:val="16223C"/>
+          <w:sz w:val="20"/>
+          <w:szCs w:val="20"/>
+        </w:rPr>
+        <w:t xml:space="preserve">Website and funnel builders: Duda and Simvoly</w:t>
       </w:r>
     </w:p>
     <w:p>
@@ -1615,7 +2640,23 @@
           <w:sz w:val="20"/>
           <w:szCs w:val="20"/>
         </w:rPr>
-        <w:t xml:space="preserve">The catch is that voice is the category where the platforms differ most, and where the difference is easy to miss until a client is live. Two things separate a voice platform you can safely put your name on from one you cannot: call quality under real conditions, and compliance. Put a branded AI on a clinic's phone line and you have taken on the liability for what it says and what it records. Many voice platforms treat compliance as a paid add-on or a higher tier, and a few skip it entirely.</w:t>
+        <w:t xml:space="preserve">Duda is the design-first choice for agencies producing many polished client sites, white-label throughout. Simvoly goes wider, adding funnels, a CRM and even course tools, with a white-label reseller path from around $59 a month and unlimited sub-accounts at the top tier. Churn is low once a site is live; the risk is that site building is commoditised, so margins thin over time.</w:t>
+      </w:r>
+    </w:p>
+    <w:p>
+      <w:pPr>
+        <w:spacing w:after="16" w:before="90"/>
+      </w:pPr>
+      <w:r>
+        <w:rPr>
+          <w:rFonts w:ascii="Calibri" w:cs="Calibri" w:eastAsia="Calibri" w:hAnsi="Calibri"/>
+          <w:b/>
+          <w:bCs/>
+          <w:color w:val="16223C"/>
+          <w:sz w:val="20"/>
+          <w:szCs w:val="20"/>
+        </w:rPr>
+        <w:t xml:space="preserve">SEO and reporting: SE Ranking and AgencyAnalytics</w:t>
       </w:r>
     </w:p>
     <w:p>
@@ -1633,7 +2674,111 @@
           <w:sz w:val="20"/>
           <w:szCs w:val="20"/>
         </w:rPr>
-        <w:t xml:space="preserve">This is the part I built Trillet around. Compliance is included on every plan, not sold back to you later: SOC 2 Type II, ISO 27001, and operation under HIPAA, GDPR, ACMA and TCPA, with full audit trails and a verifiable recording and transcript of every call. Usage is a flat $0.12 a minute, so the margin is easy to forecast, and plans start at $99 a month for Studio and $299 for Agency with unlimited client workspaces. If your clients are clinics, law firms, trades or anyone who loses real money on a missed call, that is the combination I would resell. The full picture is on the </w:t>
+        <w:t xml:space="preserve">These two get confused but do different jobs. SE Ranking gives you the actual rank tracking, audits and keyword data with a white-label client portal, via its Agency Pack add-on on top of a Core plan from around $129 a month. AgencyAnalytics is a reporting layer, excellent at turning data from other tools into branded client reports, but it does not generate the SEO data itself. Sticky when tied to a retainer; easy for a client to question if a report is all they see.</w:t>
+      </w:r>
+    </w:p>
+    <w:p>
+      <w:pPr>
+        <w:spacing w:after="16" w:before="90"/>
+      </w:pPr>
+      <w:r>
+        <w:rPr>
+          <w:rFonts w:ascii="Calibri" w:cs="Calibri" w:eastAsia="Calibri" w:hAnsi="Calibri"/>
+          <w:b/>
+          <w:bCs/>
+          <w:color w:val="16223C"/>
+          <w:sz w:val="20"/>
+          <w:szCs w:val="20"/>
+        </w:rPr>
+        <w:t xml:space="preserve">Social and review management: Sendible and SocialPilot</w:t>
+      </w:r>
+    </w:p>
+    <w:p>
+      <w:pPr>
+        <w:spacing w:after="110" w:line="278"/>
+      </w:pPr>
+      <w:r>
+        <w:rPr>
+          <w:rFonts w:ascii="Calibri" w:cs="Calibri" w:eastAsia="Calibri" w:hAnsi="Calibri"/>
+          <w:b w:val="false"/>
+          <w:bCs w:val="false"/>
+          <w:i w:val="false"/>
+          <w:iCs w:val="false"/>
+          <w:color w:val="24303F"/>
+          <w:sz w:val="20"/>
+          <w:szCs w:val="20"/>
+        </w:rPr>
+        <w:t xml:space="preserve">Both let you run many client accounts under your own brand. Sendible's white-label covers the dashboard, notifications and a custom domain, from around $299 a month. SocialPilot is the cheaper route, with white-label from about $100 a month. Reliable add-on revenue, but low differentiation, so you compete on service rather than the tool itself.</w:t>
+      </w:r>
+    </w:p>
+    <w:p>
+      <w:pPr>
+        <w:spacing w:after="16" w:before="90"/>
+      </w:pPr>
+      <w:r>
+        <w:rPr>
+          <w:rFonts w:ascii="Calibri" w:cs="Calibri" w:eastAsia="Calibri" w:hAnsi="Calibri"/>
+          <w:b/>
+          <w:bCs/>
+          <w:color w:val="16223C"/>
+          <w:sz w:val="20"/>
+          <w:szCs w:val="20"/>
+        </w:rPr>
+        <w:t xml:space="preserve">Voice AI: Trillet, Synthflow, Autocalls and others</w:t>
+      </w:r>
+    </w:p>
+    <w:p>
+      <w:pPr>
+        <w:spacing w:after="110" w:line="278"/>
+      </w:pPr>
+      <w:r>
+        <w:rPr>
+          <w:rFonts w:ascii="Calibri" w:cs="Calibri" w:eastAsia="Calibri" w:hAnsi="Calibri"/>
+          <w:b w:val="false"/>
+          <w:bCs w:val="false"/>
+          <w:i w:val="false"/>
+          <w:iCs w:val="false"/>
+          <w:color w:val="24303F"/>
+          <w:sz w:val="20"/>
+          <w:szCs w:val="20"/>
+        </w:rPr>
+        <w:t xml:space="preserve">This is the newest category and the one I would build an agency on today. A branded AI that answers every call is something a client feels working from day one, which makes it the stickiest software on this list. It is also where the platforms differ most, and where the difference is easy to miss until a client is live.</w:t>
+      </w:r>
+    </w:p>
+    <w:p>
+      <w:pPr>
+        <w:spacing w:after="110" w:line="278"/>
+      </w:pPr>
+      <w:r>
+        <w:rPr>
+          <w:rFonts w:ascii="Calibri" w:cs="Calibri" w:eastAsia="Calibri" w:hAnsi="Calibri"/>
+          <w:b w:val="false"/>
+          <w:bCs w:val="false"/>
+          <w:i w:val="false"/>
+          <w:iCs w:val="false"/>
+          <w:color w:val="24303F"/>
+          <w:sz w:val="20"/>
+          <w:szCs w:val="20"/>
+        </w:rPr>
+        <w:t xml:space="preserve">Autocalls launches fast and cheap, all-inclusive from around $0.09 a minute with unlimited sub-accounts and Stripe rebilling, a strong pick if speed and multi-channel matter more than deep compliance. Synthflow is a capable no-code voice builder with SOC 2, HIPAA, GDPR and ISO 27001, though its white-label sits on a higher tier. VoiceAIWrapper lets you resell providers like Vapi and Retell under your own brand. Stammer combines chat and voice but publishes GDPR only, with no HIPAA, which rules out healthcare.</w:t>
+      </w:r>
+    </w:p>
+    <w:p>
+      <w:pPr>
+        <w:spacing w:after="110" w:line="278"/>
+      </w:pPr>
+      <w:r>
+        <w:rPr>
+          <w:rFonts w:ascii="Calibri" w:cs="Calibri" w:eastAsia="Calibri" w:hAnsi="Calibri"/>
+          <w:b w:val="false"/>
+          <w:bCs w:val="false"/>
+          <w:i w:val="false"/>
+          <w:iCs w:val="false"/>
+          <w:color w:val="24303F"/>
+          <w:sz w:val="20"/>
+          <w:szCs w:val="20"/>
+        </w:rPr>
+        <w:t xml:space="preserve">I built Trillet for the part most of these treat as an upsell: compliance and the record. It is included on every plan, not sold back to you later, with SOC 2 Type II, ISO 27001, and operation under HIPAA, GDPR, ACMA and TCPA, plus full audit trails and a verifiable recording and transcript of every call. Usage is a flat $0.12 a minute, so the margin is easy to forecast, with Studio from $99 a month and Agency from $299 with unlimited client workspaces. If your clients are clinics, law firms or trades who lose real money on a missed call, that is the combination I would put my name on. Disclosure: Trillet is us. The full picture is on the </w:t>
       </w:r>
       <w:r>
         <w:rPr>
@@ -1847,7 +2992,7 @@
           <w:sz w:val="20"/>
           <w:szCs w:val="20"/>
         </w:rPr>
-        <w:t xml:space="preserve">Which white-label SaaS is most profitable to resell?</w:t>
+        <w:t xml:space="preserve">What are the best white-label SaaS platforms to resell?</w:t>
       </w:r>
     </w:p>
     <w:p>
@@ -1865,7 +3010,7 @@
           <w:sz w:val="20"/>
           <w:szCs w:val="20"/>
         </w:rPr>
-        <w:t xml:space="preserve">The most profitable is usually the stickiest, not the cheapest. Software tied to a client's revenue, like voice AI that answers their calls, holds margin and resists cancellation better than a tool they rarely open.</w:t>
+        <w:t xml:space="preserve">It depends on your clients. For an all-in-one suite, GoHighLevel or Vendasta; for websites, Duda or Simvoly; for SEO, SE Ranking or AgencyAnalytics; for social, Sendible or SocialPilot; for voice AI, Trillet, Synthflow or Autocalls.</w:t>
       </w:r>
     </w:p>
     <w:p>
@@ -1881,7 +3026,7 @@
           <w:sz w:val="20"/>
           <w:szCs w:val="20"/>
         </w:rPr>
-        <w:t xml:space="preserve">Can I resell SaaS without technical skills?</w:t>
+        <w:t xml:space="preserve">Which white-label SaaS is most profitable to resell?</w:t>
       </w:r>
     </w:p>
     <w:p>
@@ -1899,7 +3044,7 @@
           <w:sz w:val="20"/>
           <w:szCs w:val="20"/>
         </w:rPr>
-        <w:t xml:space="preserve">Yes. Good white-label platforms are built for agencies, not developers: you brand the product, configure it, and sell it, with no code or infrastructure to run. The work is sales and support, not engineering.</w:t>
+        <w:t xml:space="preserve">The most profitable is usually the stickiest, not the cheapest. Software tied to a client's revenue, like voice AI that answers their calls, holds margin and resists cancellation better than a tool they rarely open.</w:t>
       </w:r>
     </w:p>
     <w:p>
@@ -1915,7 +3060,7 @@
           <w:sz w:val="20"/>
           <w:szCs w:val="20"/>
         </w:rPr>
-        <w:t xml:space="preserve">How much margin can I make reselling white-label SaaS?</w:t>
+        <w:t xml:space="preserve">Can I resell SaaS without technical skills?</w:t>
       </w:r>
     </w:p>
     <w:p>
@@ -1933,7 +3078,7 @@
           <w:sz w:val="20"/>
           <w:szCs w:val="20"/>
         </w:rPr>
-        <w:t xml:space="preserve">You keep the gap between the wholesale rate and your retail price, every month a client stays. Margin depends on the category and whether pricing is flat or usage-based; on flat-rate voice AI at $0.12 a minute, agencies commonly hold margins in the 70s.</w:t>
+        <w:t xml:space="preserve">Yes. Good white-label platforms are built for agencies, not developers: you brand the product, configure it, and sell it, with no code or infrastructure to run. The work is sales and support, not engineering.</w:t>
       </w:r>
     </w:p>
     <w:p>
@@ -1949,7 +3094,7 @@
           <w:sz w:val="20"/>
           <w:szCs w:val="20"/>
         </w:rPr>
-        <w:t xml:space="preserve">What is the difference between white-label SaaS and reselling?</w:t>
+        <w:t xml:space="preserve">How much margin can I make reselling white-label SaaS?</w:t>
       </w:r>
     </w:p>
     <w:p>
@@ -1967,7 +3112,7 @@
           <w:sz w:val="20"/>
           <w:szCs w:val="20"/>
         </w:rPr>
-        <w:t xml:space="preserve">White-label means you rebrand and sell the whole product as your own. Plain reselling or an affiliate deal usually keeps the vendor's brand and pays you a referral cut. White-label is the model that builds your own recurring revenue.</w:t>
+        <w:t xml:space="preserve">You keep the gap between the wholesale rate and your retail price, every month a client stays. Margin depends on the category and whether pricing is flat or usage-based; on flat-rate voice AI at $0.12 a minute, agencies commonly hold margins in the 70s.</w:t>
       </w:r>
     </w:p>
     <w:p>
@@ -2001,7 +3146,7 @@
           <w:sz w:val="20"/>
           <w:szCs w:val="20"/>
         </w:rPr>
-        <w:t xml:space="preserve">Whichever one includes compliance and a verifiable record by default. For voice, that means SOC 2, HIPAA and the rest built in, with audit trails and call recordings, so you can sell to clinics, law firms and financial services without inheriting the risk.</w:t>
+        <w:t xml:space="preserve">Whichever one includes compliance and a verifiable record by default. For voice, that means SOC 2, HIPAA and the rest built in, with audit trails and call recordings. Trillet includes these on every plan; GoHighLevel gates HIPAA behind an add-on, and Stammer offers GDPR only.</w:t>
       </w:r>
     </w:p>
     <w:p>
@@ -2064,7 +3209,7 @@
           <w:sz w:val="17"/>
           <w:szCs w:val="17"/>
         </w:rPr>
-        <w:t xml:space="preserve">Article + FAQPage + ItemList (the category roundup) + BreadcrumbList. Keep dateModified current; author must be the real byline.</w:t>
+        <w:t xml:space="preserve">Article + FAQPage + ItemList (the named platforms) + BreadcrumbList. Keep dateModified current; author must be the real byline.</w:t>
       </w:r>
     </w:p>
     <w:tbl>
@@ -2195,7 +3340,7 @@
                 <w:sz w:val="13"/>
                 <w:szCs w:val="13"/>
               </w:rPr>
-              <w:t xml:space="preserve">    "datePublished":"2026-09-23","dateModified":"2026-09-23",</w:t>
+              <w:t xml:space="preserve">    "datePublished":"2026-09-24","dateModified":"2026-09-24",</w:t>
             </w:r>
           </w:p>
           <w:p>
@@ -2237,7 +3382,7 @@
                 <w:sz w:val="13"/>
                 <w:szCs w:val="13"/>
               </w:rPr>
-              <w:t xml:space="preserve">  { "@type":"ItemList","name":"White-label SaaS categories to resell 2026","itemListElement":[</w:t>
+              <w:t xml:space="preserve">  { "@type":"ItemList","name":"Best white-label SaaS platforms to resell 2026","itemListElement":[</w:t>
             </w:r>
           </w:p>
           <w:p>
@@ -2251,7 +3396,7 @@
                 <w:sz w:val="13"/>
                 <w:szCs w:val="13"/>
               </w:rPr>
-              <w:t xml:space="preserve">     {"@type":"ListItem","position":1,"name":"All-in-one agency suites"},</w:t>
+              <w:t xml:space="preserve">     {"@type":"ListItem","position":1,"name":"GoHighLevel"},</w:t>
             </w:r>
           </w:p>
           <w:p>
@@ -2265,7 +3410,7 @@
                 <w:sz w:val="13"/>
                 <w:szCs w:val="13"/>
               </w:rPr>
-              <w:t xml:space="preserve">     {"@type":"ListItem","position":2,"name":"Website &amp; funnel builders"},</w:t>
+              <w:t xml:space="preserve">     {"@type":"ListItem","position":2,"name":"Vendasta"},</w:t>
             </w:r>
           </w:p>
           <w:p>
@@ -2279,7 +3424,7 @@
                 <w:sz w:val="13"/>
                 <w:szCs w:val="13"/>
               </w:rPr>
-              <w:t xml:space="preserve">     {"@type":"ListItem","position":3,"name":"SEO &amp; reporting"},</w:t>
+              <w:t xml:space="preserve">     {"@type":"ListItem","position":3,"name":"Duda"},</w:t>
             </w:r>
           </w:p>
           <w:p>
@@ -2293,7 +3438,7 @@
                 <w:sz w:val="13"/>
                 <w:szCs w:val="13"/>
               </w:rPr>
-              <w:t xml:space="preserve">     {"@type":"ListItem","position":4,"name":"Email &amp; automation"},</w:t>
+              <w:t xml:space="preserve">     {"@type":"ListItem","position":4,"name":"Simvoly"},</w:t>
             </w:r>
           </w:p>
           <w:p>
@@ -2307,7 +3452,7 @@
                 <w:sz w:val="13"/>
                 <w:szCs w:val="13"/>
               </w:rPr>
-              <w:t xml:space="preserve">     {"@type":"ListItem","position":5,"name":"Review &amp; social management"},</w:t>
+              <w:t xml:space="preserve">     {"@type":"ListItem","position":5,"name":"SE Ranking"},</w:t>
             </w:r>
           </w:p>
           <w:p>
@@ -2321,7 +3466,105 @@
                 <w:sz w:val="13"/>
                 <w:szCs w:val="13"/>
               </w:rPr>
-              <w:t xml:space="preserve">     {"@type":"ListItem","position":6,"name":"Voice AI"} ] },</w:t>
+              <w:t xml:space="preserve">     {"@type":"ListItem","position":6,"name":"AgencyAnalytics"},</w:t>
+            </w:r>
+          </w:p>
+          <w:p>
+            <w:pPr>
+              <w:spacing w:after="0" w:line="230"/>
+            </w:pPr>
+            <w:r>
+              <w:rPr>
+                <w:rFonts w:ascii="Consolas" w:cs="Consolas" w:eastAsia="Consolas" w:hAnsi="Consolas"/>
+                <w:color w:val="24303F"/>
+                <w:sz w:val="13"/>
+                <w:szCs w:val="13"/>
+              </w:rPr>
+              <w:t xml:space="preserve">     {"@type":"ListItem","position":7,"name":"Sendible"},</w:t>
+            </w:r>
+          </w:p>
+          <w:p>
+            <w:pPr>
+              <w:spacing w:after="0" w:line="230"/>
+            </w:pPr>
+            <w:r>
+              <w:rPr>
+                <w:rFonts w:ascii="Consolas" w:cs="Consolas" w:eastAsia="Consolas" w:hAnsi="Consolas"/>
+                <w:color w:val="24303F"/>
+                <w:sz w:val="13"/>
+                <w:szCs w:val="13"/>
+              </w:rPr>
+              <w:t xml:space="preserve">     {"@type":"ListItem","position":8,"name":"SocialPilot"},</w:t>
+            </w:r>
+          </w:p>
+          <w:p>
+            <w:pPr>
+              <w:spacing w:after="0" w:line="230"/>
+            </w:pPr>
+            <w:r>
+              <w:rPr>
+                <w:rFonts w:ascii="Consolas" w:cs="Consolas" w:eastAsia="Consolas" w:hAnsi="Consolas"/>
+                <w:color w:val="24303F"/>
+                <w:sz w:val="13"/>
+                <w:szCs w:val="13"/>
+              </w:rPr>
+              <w:t xml:space="preserve">     {"@type":"ListItem","position":9,"name":"Trillet"},</w:t>
+            </w:r>
+          </w:p>
+          <w:p>
+            <w:pPr>
+              <w:spacing w:after="0" w:line="230"/>
+            </w:pPr>
+            <w:r>
+              <w:rPr>
+                <w:rFonts w:ascii="Consolas" w:cs="Consolas" w:eastAsia="Consolas" w:hAnsi="Consolas"/>
+                <w:color w:val="24303F"/>
+                <w:sz w:val="13"/>
+                <w:szCs w:val="13"/>
+              </w:rPr>
+              <w:t xml:space="preserve">     {"@type":"ListItem","position":10,"name":"Synthflow"},</w:t>
+            </w:r>
+          </w:p>
+          <w:p>
+            <w:pPr>
+              <w:spacing w:after="0" w:line="230"/>
+            </w:pPr>
+            <w:r>
+              <w:rPr>
+                <w:rFonts w:ascii="Consolas" w:cs="Consolas" w:eastAsia="Consolas" w:hAnsi="Consolas"/>
+                <w:color w:val="24303F"/>
+                <w:sz w:val="13"/>
+                <w:szCs w:val="13"/>
+              </w:rPr>
+              <w:t xml:space="preserve">     {"@type":"ListItem","position":11,"name":"Autocalls"},</w:t>
+            </w:r>
+          </w:p>
+          <w:p>
+            <w:pPr>
+              <w:spacing w:after="0" w:line="230"/>
+            </w:pPr>
+            <w:r>
+              <w:rPr>
+                <w:rFonts w:ascii="Consolas" w:cs="Consolas" w:eastAsia="Consolas" w:hAnsi="Consolas"/>
+                <w:color w:val="24303F"/>
+                <w:sz w:val="13"/>
+                <w:szCs w:val="13"/>
+              </w:rPr>
+              <w:t xml:space="preserve">     {"@type":"ListItem","position":12,"name":"VoiceAIWrapper"},</w:t>
+            </w:r>
+          </w:p>
+          <w:p>
+            <w:pPr>
+              <w:spacing w:after="0" w:line="230"/>
+            </w:pPr>
+            <w:r>
+              <w:rPr>
+                <w:rFonts w:ascii="Consolas" w:cs="Consolas" w:eastAsia="Consolas" w:hAnsi="Consolas"/>
+                <w:color w:val="24303F"/>
+                <w:sz w:val="13"/>
+                <w:szCs w:val="13"/>
+              </w:rPr>
+              <w:t xml:space="preserve">     {"@type":"ListItem","position":13,"name":"Stammer"} ] },</w:t>
             </w:r>
           </w:p>
           <w:p>

</xml_diff>

<commit_message>
Convert Blog 3 to team 'we' voice
Shift the masthead voice from founder singular 'I' to team 'we', grounded in
Trillet's real vantage point (we build white-label voice AI for agencies)
rather than any unverified reselling history or client quotes. Keeps all 13
named platforms, verified facts, reconciled Trillet figures and the disclosure.
Full sanity check passed: no singular-I in body, no fabricated client claims,
zero em-dashes, meta lengths correct.

Co-Authored-By: Claude Opus 4.8 <noreply@anthropic.com>
Claude-Session: https://claude.ai/code/session_01UhVChLeNNjFDr6eASTMGhh
</commit_message>
<xml_diff>
--- a/seo-audit/Article-03-White-Label-SaaS-Platforms.docx
+++ b/seo-audit/Article-03-White-Label-SaaS-Platforms.docx
@@ -32,7 +32,7 @@
           <w:sz w:val="34"/>
           <w:szCs w:val="34"/>
         </w:rPr>
-        <w:t xml:space="preserve">The White-Label SaaS Worth Reselling in 2026, From Someone Who Has Sold It</w:t>
+        <w:t xml:space="preserve">The White-Label SaaS Worth Reselling in 2026, Compared by a Team That Builds It</w:t>
       </w:r>
     </w:p>
     <w:p>
@@ -221,7 +221,7 @@
           <w:sz w:val="17"/>
           <w:szCs w:val="17"/>
         </w:rPr>
-        <w:t xml:space="preserve">Founder who has resold SaaS and now builds it. First person, honest, useful. No hype, Australian spelling, no em-dashes.</w:t>
+        <w:t xml:space="preserve">The Trillet team, first person plural. Honest and useful, grounded in building white-label voice AI for agencies. No hype, Australian spelling, no em-dashes.</w:t>
       </w:r>
     </w:p>
     <w:p>
@@ -277,7 +277,7 @@
           <w:sz w:val="20"/>
           <w:szCs w:val="20"/>
         </w:rPr>
-        <w:t xml:space="preserve">I have made money reselling other people's software, and I have lost it too. Before I built Trillet I ran an agency, and white-label SaaS was how we turned one-off projects into something that paid us every month. The trick was never finding software to rebrand, there is plenty. The trick was picking the few platforms that carried a real margin, that clients would not cancel, and that would not embarrass us when something went wrong. Below are the white-label SaaS platforms I would actually resell in 2026, named and sorted by category, with an honest note on where each one earns its keep.</w:t>
+        <w:t xml:space="preserve">We build white-label voice AI for agencies, so we spend our days around the reselling model and the platforms that make it work. White-label SaaS is how an agency turns one-off projects into revenue that arrives every month. The hard part was never finding software to rebrand, there is plenty of it. It is picking the few platforms that carry a real margin, that clients will not cancel, and that will not embarrass you when something goes wrong. Below are the white-label SaaS platforms we would resell in 2026, named and sorted by category, with an honest note on where each one earns its keep.</w:t>
       </w:r>
     </w:p>
     <w:tbl>
@@ -406,7 +406,7 @@
           <w:sz w:val="25"/>
           <w:szCs w:val="25"/>
         </w:rPr>
-        <w:t xml:space="preserve">How I decide what is worth reselling</w:t>
+        <w:t xml:space="preserve">How we decide what is worth reselling</w:t>
       </w:r>
     </w:p>
     <w:p>
@@ -424,7 +424,7 @@
           <w:sz w:val="20"/>
           <w:szCs w:val="20"/>
         </w:rPr>
-        <w:t xml:space="preserve">Not all white-label SaaS is worth your name. After a few costly lessons I run every candidate through four questions before I touch it.</w:t>
+        <w:t xml:space="preserve">Not all white-label SaaS is worth your name. We run every candidate through four questions before we would put a client on it.</w:t>
       </w:r>
     </w:p>
     <w:p>
@@ -602,7 +602,7 @@
           <w:sz w:val="20"/>
           <w:szCs w:val="20"/>
         </w:rPr>
-        <w:t xml:space="preserve">Here are the platforms I would shortlist, by category, with what you actually rebrand and who each one suits. Prices and terms move, so treat the figures as the shape of the market and confirm the current numbers before you commit.</w:t>
+        <w:t xml:space="preserve">Here are the platforms we would shortlist, by category, with what you actually rebrand and who each one suits. Prices and terms move, so treat the figures as the shape of the market and confirm the current numbers before you commit.</w:t>
       </w:r>
     </w:p>
     <w:tbl>
@@ -2742,7 +2742,7 @@
           <w:sz w:val="20"/>
           <w:szCs w:val="20"/>
         </w:rPr>
-        <w:t xml:space="preserve">This is the newest category and the one I would build an agency on today. A branded AI that answers every call is something a client feels working from day one, which makes it the stickiest software on this list. It is also where the platforms differ most, and where the difference is easy to miss until a client is live.</w:t>
+        <w:t xml:space="preserve">This is the newest category and the one we would build an agency on today. A branded AI that answers every call is something a client feels working from day one, which makes it the stickiest software on this list. It is also where the platforms differ most, and where the difference is easy to miss until a client is live.</w:t>
       </w:r>
     </w:p>
     <w:p>
@@ -2778,7 +2778,7 @@
           <w:sz w:val="20"/>
           <w:szCs w:val="20"/>
         </w:rPr>
-        <w:t xml:space="preserve">I built Trillet for the part most of these treat as an upsell: compliance and the record. It is included on every plan, not sold back to you later, with SOC 2 Type II, ISO 27001, and operation under HIPAA, GDPR, ACMA and TCPA, plus full audit trails and a verifiable recording and transcript of every call. Usage is a flat $0.12 a minute, so the margin is easy to forecast, with Studio from $99 a month and Agency from $299 with unlimited client workspaces. If your clients are clinics, law firms or trades who lose real money on a missed call, that is the combination I would put my name on. Disclosure: Trillet is us. The full picture is on the </w:t>
+        <w:t xml:space="preserve">We built Trillet for the part most of these treat as an upsell: compliance and the record. It is included on every plan, not sold back to you later, with SOC 2 Type II, ISO 27001, and operation under HIPAA, GDPR, ACMA and TCPA, plus full audit trails and a verifiable recording and transcript of every call. Usage is a flat $0.12 a minute, so the margin is easy to forecast, with Studio from $99 a month and Agency from $299 with unlimited client workspaces. If your clients are clinics, law firms or trades who lose real money on a missed call, that is the combination we would put our name on. Disclosure: Trillet is our platform. The full picture is on the </w:t>
       </w:r>
       <w:r>
         <w:rPr>

</xml_diff>

<commit_message>
Expand Blog 3 to one detailed profile per platform
Replace the bunched category paragraphs with an individual write-up for each of
the 13 named platforms (what it is, white-label depth, verified pricing,
compliance, best-for / watch-for), grouped by category with the comparison
table kept as the up-top quick-reference. Voice AI now carries five individual
profiles with Trillet featured. Team 'we' voice throughout, all facts verified
Sep 2026, zero em-dashes, ~2,510 words.

Co-Authored-By: Claude Opus 4.8 <noreply@anthropic.com>
Claude-Session: https://claude.ai/code/session_01UhVChLeNNjFDr6eASTMGhh
</commit_message>
<xml_diff>
--- a/seo-audit/Article-03-White-Label-SaaS-Platforms.docx
+++ b/seo-audit/Article-03-White-Label-SaaS-Platforms.docx
@@ -2572,7 +2572,25 @@
           <w:sz w:val="25"/>
           <w:szCs w:val="25"/>
         </w:rPr>
-        <w:t xml:space="preserve">The categories, and who leads each</w:t>
+        <w:t xml:space="preserve">The platforms in detail</w:t>
+      </w:r>
+    </w:p>
+    <w:p>
+      <w:pPr>
+        <w:spacing w:after="110" w:line="278"/>
+      </w:pPr>
+      <w:r>
+        <w:rPr>
+          <w:rFonts w:ascii="Calibri" w:cs="Calibri" w:eastAsia="Calibri" w:hAnsi="Calibri"/>
+          <w:b w:val="false"/>
+          <w:bCs w:val="false"/>
+          <w:i w:val="false"/>
+          <w:iCs w:val="false"/>
+          <w:color w:val="5A6675"/>
+          <w:sz w:val="18"/>
+          <w:szCs w:val="18"/>
+        </w:rPr>
+        <w:t xml:space="preserve">A closer look at each, with what it does, how the white-label works, what it costs, and where it fits. Grouped by category so you can jump to the one you sell.</w:t>
       </w:r>
     </w:p>
     <w:p>
@@ -2588,7 +2606,7 @@
           <w:sz w:val="20"/>
           <w:szCs w:val="20"/>
         </w:rPr>
-        <w:t xml:space="preserve">All-in-one agency suites: GoHighLevel and Vendasta</w:t>
+        <w:t xml:space="preserve">All-in-one agency suites</w:t>
       </w:r>
     </w:p>
     <w:p>
@@ -2598,15 +2616,59 @@
       <w:r>
         <w:rPr>
           <w:rFonts w:ascii="Calibri" w:cs="Calibri" w:eastAsia="Calibri" w:hAnsi="Calibri"/>
-          <w:b w:val="false"/>
-          <w:bCs w:val="false"/>
-          <w:i w:val="false"/>
-          <w:iCs w:val="false"/>
-          <w:color w:val="24303F"/>
-          <w:sz w:val="20"/>
-          <w:szCs w:val="20"/>
-        </w:rPr>
-        <w:t xml:space="preserve">If you want one platform to run most of an agency, these two lead. GoHighLevel bundles CRM, funnels, email, booking and a growing set of AI features, all fully white-label, though HIPAA is a paid add-on rather than standard. Vendasta is more of a marketplace, letting you resell a broad catalogue of digital services under your brand, with SOC 2 Type II behind it. Both are sticky once a client runs their business on them, but you are reselling a whole platform, not a focused tool.</w:t>
+          <w:b/>
+          <w:bCs/>
+          <w:i w:val="false"/>
+          <w:iCs w:val="false"/>
+          <w:color w:val="24303F"/>
+          <w:sz w:val="20"/>
+          <w:szCs w:val="20"/>
+        </w:rPr>
+        <w:t xml:space="preserve">GoHighLevel. </w:t>
+      </w:r>
+      <w:r>
+        <w:rPr>
+          <w:rFonts w:ascii="Calibri" w:cs="Calibri" w:eastAsia="Calibri" w:hAnsi="Calibri"/>
+          <w:b w:val="false"/>
+          <w:bCs w:val="false"/>
+          <w:i w:val="false"/>
+          <w:iCs w:val="false"/>
+          <w:color w:val="24303F"/>
+          <w:sz w:val="20"/>
+          <w:szCs w:val="20"/>
+        </w:rPr>
+        <w:t xml:space="preserve">The default all-in-one for agencies. It bundles CRM, sales funnels, email and SMS, booking, pipelines and a growing set of AI features into one platform you run entirely under your own brand and domain. It is fully white-label and reached SOC 2 Type II in early 2026. The catch for regulated work is HIPAA: it is not standard, it comes as a paid add-on (around $297 a month) with a signed BAA and per-sub-account setup. Best for agencies that want one system to run everything and will resell the whole platform. Watch for the learning curve, and voice that sits shallow next to a dedicated tool.</w:t>
+      </w:r>
+    </w:p>
+    <w:p>
+      <w:pPr>
+        <w:spacing w:after="110" w:line="278"/>
+      </w:pPr>
+      <w:r>
+        <w:rPr>
+          <w:rFonts w:ascii="Calibri" w:cs="Calibri" w:eastAsia="Calibri" w:hAnsi="Calibri"/>
+          <w:b/>
+          <w:bCs/>
+          <w:i w:val="false"/>
+          <w:iCs w:val="false"/>
+          <w:color w:val="24303F"/>
+          <w:sz w:val="20"/>
+          <w:szCs w:val="20"/>
+        </w:rPr>
+        <w:t xml:space="preserve">Vendasta. </w:t>
+      </w:r>
+      <w:r>
+        <w:rPr>
+          <w:rFonts w:ascii="Calibri" w:cs="Calibri" w:eastAsia="Calibri" w:hAnsi="Calibri"/>
+          <w:b w:val="false"/>
+          <w:bCs w:val="false"/>
+          <w:i w:val="false"/>
+          <w:iCs w:val="false"/>
+          <w:color w:val="24303F"/>
+          <w:sz w:val="20"/>
+          <w:szCs w:val="20"/>
+        </w:rPr>
+        <w:t xml:space="preserve">Less a single product, more a marketplace. Vendasta lets you resell a catalogue of 250-plus digital solutions, from listings and reviews to websites and its own AI Workforce, all under your brand, with SOC 2 Type II behind it and REST APIs for deeper embeds. Best for agencies that want breadth, a store of services to sell rather than one tool to master. Watch for depth: you are curating a catalogue, so any single category is shallower than a specialist, and margins vary by product.</w:t>
       </w:r>
     </w:p>
     <w:p>
@@ -2622,7 +2684,7 @@
           <w:sz w:val="20"/>
           <w:szCs w:val="20"/>
         </w:rPr>
-        <w:t xml:space="preserve">Website and funnel builders: Duda and Simvoly</w:t>
+        <w:t xml:space="preserve">Website and funnel builders</w:t>
       </w:r>
     </w:p>
     <w:p>
@@ -2632,15 +2694,59 @@
       <w:r>
         <w:rPr>
           <w:rFonts w:ascii="Calibri" w:cs="Calibri" w:eastAsia="Calibri" w:hAnsi="Calibri"/>
-          <w:b w:val="false"/>
-          <w:bCs w:val="false"/>
-          <w:i w:val="false"/>
-          <w:iCs w:val="false"/>
-          <w:color w:val="24303F"/>
-          <w:sz w:val="20"/>
-          <w:szCs w:val="20"/>
-        </w:rPr>
-        <w:t xml:space="preserve">Duda is the design-first choice for agencies producing many polished client sites, white-label throughout. Simvoly goes wider, adding funnels, a CRM and even course tools, with a white-label reseller path from around $59 a month and unlimited sub-accounts at the top tier. Churn is low once a site is live; the risk is that site building is commoditised, so margins thin over time.</w:t>
+          <w:b/>
+          <w:bCs/>
+          <w:i w:val="false"/>
+          <w:iCs w:val="false"/>
+          <w:color w:val="24303F"/>
+          <w:sz w:val="20"/>
+          <w:szCs w:val="20"/>
+        </w:rPr>
+        <w:t xml:space="preserve">Duda. </w:t>
+      </w:r>
+      <w:r>
+        <w:rPr>
+          <w:rFonts w:ascii="Calibri" w:cs="Calibri" w:eastAsia="Calibri" w:hAnsi="Calibri"/>
+          <w:b w:val="false"/>
+          <w:bCs w:val="false"/>
+          <w:i w:val="false"/>
+          <w:iCs w:val="false"/>
+          <w:color w:val="24303F"/>
+          <w:sz w:val="20"/>
+          <w:szCs w:val="20"/>
+        </w:rPr>
+        <w:t xml:space="preserve">A design-first website builder made for agencies producing client sites at volume. It is white-label throughout, and its strength is structured, repeatable, polished web production, dozens or hundreds of sites without the output looking templated. Best for agencies whose core service is websites and who value craft and team workflows. Watch for scope: it is a site builder, not a funnel-and-CRM platform, so it does one thing very well rather than many.</w:t>
+      </w:r>
+    </w:p>
+    <w:p>
+      <w:pPr>
+        <w:spacing w:after="110" w:line="278"/>
+      </w:pPr>
+      <w:r>
+        <w:rPr>
+          <w:rFonts w:ascii="Calibri" w:cs="Calibri" w:eastAsia="Calibri" w:hAnsi="Calibri"/>
+          <w:b/>
+          <w:bCs/>
+          <w:i w:val="false"/>
+          <w:iCs w:val="false"/>
+          <w:color w:val="24303F"/>
+          <w:sz w:val="20"/>
+          <w:szCs w:val="20"/>
+        </w:rPr>
+        <w:t xml:space="preserve">Simvoly. </w:t>
+      </w:r>
+      <w:r>
+        <w:rPr>
+          <w:rFonts w:ascii="Calibri" w:cs="Calibri" w:eastAsia="Calibri" w:hAnsi="Calibri"/>
+          <w:b w:val="false"/>
+          <w:bCs w:val="false"/>
+          <w:i w:val="false"/>
+          <w:iCs w:val="false"/>
+          <w:color w:val="24303F"/>
+          <w:sz w:val="20"/>
+          <w:szCs w:val="20"/>
+        </w:rPr>
+        <w:t xml:space="preserve">A wider builder spanning websites, sales funnels, e-commerce, a CRM and even course and community tools. Its white-label reseller path is one of the most affordable, from around $59 a month, with unlimited sub-accounts and no per-site fees at the top tier (around $497 a month), which makes the unit economics at 50 or 100 clients genuinely interesting. Best for agencies that want sites plus funnels under one brand without paying suite prices. Watch for the breadth-versus-polish trade against a pure specialist like Duda.</w:t>
       </w:r>
     </w:p>
     <w:p>
@@ -2656,7 +2762,7 @@
           <w:sz w:val="20"/>
           <w:szCs w:val="20"/>
         </w:rPr>
-        <w:t xml:space="preserve">SEO and reporting: SE Ranking and AgencyAnalytics</w:t>
+        <w:t xml:space="preserve">SEO and reporting</w:t>
       </w:r>
     </w:p>
     <w:p>
@@ -2666,15 +2772,59 @@
       <w:r>
         <w:rPr>
           <w:rFonts w:ascii="Calibri" w:cs="Calibri" w:eastAsia="Calibri" w:hAnsi="Calibri"/>
-          <w:b w:val="false"/>
-          <w:bCs w:val="false"/>
-          <w:i w:val="false"/>
-          <w:iCs w:val="false"/>
-          <w:color w:val="24303F"/>
-          <w:sz w:val="20"/>
-          <w:szCs w:val="20"/>
-        </w:rPr>
-        <w:t xml:space="preserve">These two get confused but do different jobs. SE Ranking gives you the actual rank tracking, audits and keyword data with a white-label client portal, via its Agency Pack add-on on top of a Core plan from around $129 a month. AgencyAnalytics is a reporting layer, excellent at turning data from other tools into branded client reports, but it does not generate the SEO data itself. Sticky when tied to a retainer; easy for a client to question if a report is all they see.</w:t>
+          <w:b/>
+          <w:bCs/>
+          <w:i w:val="false"/>
+          <w:iCs w:val="false"/>
+          <w:color w:val="24303F"/>
+          <w:sz w:val="20"/>
+          <w:szCs w:val="20"/>
+        </w:rPr>
+        <w:t xml:space="preserve">SE Ranking. </w:t>
+      </w:r>
+      <w:r>
+        <w:rPr>
+          <w:rFonts w:ascii="Calibri" w:cs="Calibri" w:eastAsia="Calibri" w:hAnsi="Calibri"/>
+          <w:b w:val="false"/>
+          <w:bCs w:val="false"/>
+          <w:i w:val="false"/>
+          <w:iCs w:val="false"/>
+          <w:color w:val="24303F"/>
+          <w:sz w:val="20"/>
+          <w:szCs w:val="20"/>
+        </w:rPr>
+        <w:t xml:space="preserve">A full SEO platform, not just a report generator. You get native rank tracking, site audits, keyword and GEO data, with a white-label client portal via its Agency Pack add-on (around $69 a month on top of a Core plan from about $129 a month on annual billing). Best for agencies that sell SEO as a service and need the underlying data to be theirs, branded end to end. Watch for the add-on structure: white-label is an extra line, not baked into the base price.</w:t>
+      </w:r>
+    </w:p>
+    <w:p>
+      <w:pPr>
+        <w:spacing w:after="110" w:line="278"/>
+      </w:pPr>
+      <w:r>
+        <w:rPr>
+          <w:rFonts w:ascii="Calibri" w:cs="Calibri" w:eastAsia="Calibri" w:hAnsi="Calibri"/>
+          <w:b/>
+          <w:bCs/>
+          <w:i w:val="false"/>
+          <w:iCs w:val="false"/>
+          <w:color w:val="24303F"/>
+          <w:sz w:val="20"/>
+          <w:szCs w:val="20"/>
+        </w:rPr>
+        <w:t xml:space="preserve">AgencyAnalytics. </w:t>
+      </w:r>
+      <w:r>
+        <w:rPr>
+          <w:rFonts w:ascii="Calibri" w:cs="Calibri" w:eastAsia="Calibri" w:hAnsi="Calibri"/>
+          <w:b w:val="false"/>
+          <w:bCs w:val="false"/>
+          <w:i w:val="false"/>
+          <w:iCs w:val="false"/>
+          <w:color w:val="24303F"/>
+          <w:sz w:val="20"/>
+          <w:szCs w:val="20"/>
+        </w:rPr>
+        <w:t xml:space="preserve">A reporting and dashboard layer. Its job is to pull data from the tools you already use, search, ads, rank trackers, and turn it into clean, branded client reports and live dashboards. It does not generate the SEO data itself, so it complements a tool like SE Ranking rather than replacing it. Best for agencies drowning in manual reporting who want white-label client dashboards fast. Watch for the risk of clients questioning spend if a monthly report is the only thing they see.</w:t>
       </w:r>
     </w:p>
     <w:p>
@@ -2690,7 +2840,7 @@
           <w:sz w:val="20"/>
           <w:szCs w:val="20"/>
         </w:rPr>
-        <w:t xml:space="preserve">Social and review management: Sendible and SocialPilot</w:t>
+        <w:t xml:space="preserve">Social and review management</w:t>
       </w:r>
     </w:p>
     <w:p>
@@ -2700,15 +2850,59 @@
       <w:r>
         <w:rPr>
           <w:rFonts w:ascii="Calibri" w:cs="Calibri" w:eastAsia="Calibri" w:hAnsi="Calibri"/>
-          <w:b w:val="false"/>
-          <w:bCs w:val="false"/>
-          <w:i w:val="false"/>
-          <w:iCs w:val="false"/>
-          <w:color w:val="24303F"/>
-          <w:sz w:val="20"/>
-          <w:szCs w:val="20"/>
-        </w:rPr>
-        <w:t xml:space="preserve">Both let you run many client accounts under your own brand. Sendible's white-label covers the dashboard, notifications and a custom domain, from around $299 a month. SocialPilot is the cheaper route, with white-label from about $100 a month. Reliable add-on revenue, but low differentiation, so you compete on service rather than the tool itself.</w:t>
+          <w:b/>
+          <w:bCs/>
+          <w:i w:val="false"/>
+          <w:iCs w:val="false"/>
+          <w:color w:val="24303F"/>
+          <w:sz w:val="20"/>
+          <w:szCs w:val="20"/>
+        </w:rPr>
+        <w:t xml:space="preserve">Sendible. </w:t>
+      </w:r>
+      <w:r>
+        <w:rPr>
+          <w:rFonts w:ascii="Calibri" w:cs="Calibri" w:eastAsia="Calibri" w:hAnsi="Calibri"/>
+          <w:b w:val="false"/>
+          <w:bCs w:val="false"/>
+          <w:i w:val="false"/>
+          <w:iCs w:val="false"/>
+          <w:color w:val="24303F"/>
+          <w:sz w:val="20"/>
+          <w:szCs w:val="20"/>
+        </w:rPr>
+        <w:t xml:space="preserve">A social media management platform built with agencies in mind. Its white-label covers the dashboard, email notifications and a custom domain, and the agency tier (from around $299 a month) allows unlimited users and dozens of social profiles with branded reports. Best for agencies running social for many clients who want the whole workspace to look like their own product. Watch for cost as profiles scale.</w:t>
+      </w:r>
+    </w:p>
+    <w:p>
+      <w:pPr>
+        <w:spacing w:after="110" w:line="278"/>
+      </w:pPr>
+      <w:r>
+        <w:rPr>
+          <w:rFonts w:ascii="Calibri" w:cs="Calibri" w:eastAsia="Calibri" w:hAnsi="Calibri"/>
+          <w:b/>
+          <w:bCs/>
+          <w:i w:val="false"/>
+          <w:iCs w:val="false"/>
+          <w:color w:val="24303F"/>
+          <w:sz w:val="20"/>
+          <w:szCs w:val="20"/>
+        </w:rPr>
+        <w:t xml:space="preserve">SocialPilot. </w:t>
+      </w:r>
+      <w:r>
+        <w:rPr>
+          <w:rFonts w:ascii="Calibri" w:cs="Calibri" w:eastAsia="Calibri" w:hAnsi="Calibri"/>
+          <w:b w:val="false"/>
+          <w:bCs w:val="false"/>
+          <w:i w:val="false"/>
+          <w:iCs w:val="false"/>
+          <w:color w:val="24303F"/>
+          <w:sz w:val="20"/>
+          <w:szCs w:val="20"/>
+        </w:rPr>
+        <w:t xml:space="preserve">The value pick in social management. White-label starts from around $100 a month on the Premium plan, with advanced white-label plus more accounts and users on the Ultimate plan (around $200 a month), covering the dashboard, reports and branding. Best for agencies that want a capable, cheaper white-label social tool. Watch for low differentiation, you will compete on service rather than the software.</w:t>
       </w:r>
     </w:p>
     <w:p>
@@ -2724,7 +2918,7 @@
           <w:sz w:val="20"/>
           <w:szCs w:val="20"/>
         </w:rPr>
-        <w:t xml:space="preserve">Voice AI: Trillet, Synthflow, Autocalls and others</w:t>
+        <w:t xml:space="preserve">Voice AI</w:t>
       </w:r>
     </w:p>
     <w:p>
@@ -2742,7 +2936,7 @@
           <w:sz w:val="20"/>
           <w:szCs w:val="20"/>
         </w:rPr>
-        <w:t xml:space="preserve">This is the newest category and the one we would build an agency on today. A branded AI that answers every call is something a client feels working from day one, which makes it the stickiest software on this list. It is also where the platforms differ most, and where the difference is easy to miss until a client is live.</w:t>
+        <w:t xml:space="preserve">This is the newest category and the one we would build an agency on today. A branded AI that answers every call is something a client feels working from day one, which makes it the stickiest software on this list. It is also where the platforms differ most, and where the difference is easy to miss until a client is live, so it is worth reading these one by one.</w:t>
       </w:r>
     </w:p>
     <w:p>
@@ -2752,33 +2946,28 @@
       <w:r>
         <w:rPr>
           <w:rFonts w:ascii="Calibri" w:cs="Calibri" w:eastAsia="Calibri" w:hAnsi="Calibri"/>
-          <w:b w:val="false"/>
-          <w:bCs w:val="false"/>
-          <w:i w:val="false"/>
-          <w:iCs w:val="false"/>
-          <w:color w:val="24303F"/>
-          <w:sz w:val="20"/>
-          <w:szCs w:val="20"/>
-        </w:rPr>
-        <w:t xml:space="preserve">Autocalls launches fast and cheap, all-inclusive from around $0.09 a minute with unlimited sub-accounts and Stripe rebilling, a strong pick if speed and multi-channel matter more than deep compliance. Synthflow is a capable no-code voice builder with SOC 2, HIPAA, GDPR and ISO 27001, though its white-label sits on a higher tier. VoiceAIWrapper lets you resell providers like Vapi and Retell under your own brand. Stammer combines chat and voice but publishes GDPR only, with no HIPAA, which rules out healthcare.</w:t>
-      </w:r>
-    </w:p>
-    <w:p>
-      <w:pPr>
-        <w:spacing w:after="110" w:line="278"/>
-      </w:pPr>
-      <w:r>
-        <w:rPr>
-          <w:rFonts w:ascii="Calibri" w:cs="Calibri" w:eastAsia="Calibri" w:hAnsi="Calibri"/>
-          <w:b w:val="false"/>
-          <w:bCs w:val="false"/>
-          <w:i w:val="false"/>
-          <w:iCs w:val="false"/>
-          <w:color w:val="24303F"/>
-          <w:sz w:val="20"/>
-          <w:szCs w:val="20"/>
-        </w:rPr>
-        <w:t xml:space="preserve">We built Trillet for the part most of these treat as an upsell: compliance and the record. It is included on every plan, not sold back to you later, with SOC 2 Type II, ISO 27001, and operation under HIPAA, GDPR, ACMA and TCPA, plus full audit trails and a verifiable recording and transcript of every call. Usage is a flat $0.12 a minute, so the margin is easy to forecast, with Studio from $99 a month and Agency from $299 with unlimited client workspaces. If your clients are clinics, law firms or trades who lose real money on a missed call, that is the combination we would put our name on. Disclosure: Trillet is our platform. The full picture is on the </w:t>
+          <w:b/>
+          <w:bCs/>
+          <w:i w:val="false"/>
+          <w:iCs w:val="false"/>
+          <w:color w:val="24303F"/>
+          <w:sz w:val="20"/>
+          <w:szCs w:val="20"/>
+        </w:rPr>
+        <w:t xml:space="preserve">Trillet. </w:t>
+      </w:r>
+      <w:r>
+        <w:rPr>
+          <w:rFonts w:ascii="Calibri" w:cs="Calibri" w:eastAsia="Calibri" w:hAnsi="Calibri"/>
+          <w:b w:val="false"/>
+          <w:bCs w:val="false"/>
+          <w:i w:val="false"/>
+          <w:iCs w:val="false"/>
+          <w:color w:val="24303F"/>
+          <w:sz w:val="20"/>
+          <w:szCs w:val="20"/>
+        </w:rPr>
+        <w:t xml:space="preserve">Disclosure first: this is us, so weigh the rest accordingly. We built Trillet as a voice-first white-label platform for agencies whose clients cannot afford a mishandled call. It is fully white-label, your domain, dashboard and billing, with an isolated workspace per client. The part we lead with is compliance and the record: SOC 2 Type II, ISO 27001, and operation under HIPAA, GDPR, ACMA and TCPA on every plan, not as an add-on, with full audit trails and a verifiable recording and transcript of every call. Usage is a flat $0.12 a minute, so margin is easy to forecast; Studio is $99 a month and Agency $299 with unlimited client workspaces. Best for phone-heavy or regulated clients: clinics, law firms, trades. Watch for fit, if you want a broad marketing stack rather than a focused phone product, an all-in-one suite will suit you better. The full picture is on the </w:t>
       </w:r>
       <w:r>
         <w:rPr>
@@ -2811,6 +3000,130 @@
           <w:szCs w:val="20"/>
         </w:rPr>
         <w:t xml:space="preserve"> page.</w:t>
+      </w:r>
+    </w:p>
+    <w:p>
+      <w:pPr>
+        <w:spacing w:after="110" w:line="278"/>
+      </w:pPr>
+      <w:r>
+        <w:rPr>
+          <w:rFonts w:ascii="Calibri" w:cs="Calibri" w:eastAsia="Calibri" w:hAnsi="Calibri"/>
+          <w:b/>
+          <w:bCs/>
+          <w:i w:val="false"/>
+          <w:iCs w:val="false"/>
+          <w:color w:val="24303F"/>
+          <w:sz w:val="20"/>
+          <w:szCs w:val="20"/>
+        </w:rPr>
+        <w:t xml:space="preserve">Synthflow. </w:t>
+      </w:r>
+      <w:r>
+        <w:rPr>
+          <w:rFonts w:ascii="Calibri" w:cs="Calibri" w:eastAsia="Calibri" w:hAnsi="Calibri"/>
+          <w:b w:val="false"/>
+          <w:bCs w:val="false"/>
+          <w:i w:val="false"/>
+          <w:iCs w:val="false"/>
+          <w:color w:val="24303F"/>
+          <w:sz w:val="20"/>
+          <w:szCs w:val="20"/>
+        </w:rPr>
+        <w:t xml:space="preserve">A capable no-code voice AI builder with a strong compliance story: SOC 2, HIPAA, GDPR and ISO 27001, EU hosting, 200-plus integrations and low-latency telephony. Best for agencies that want to build voice flows visually on a well-certified platform. Watch for the white-label, which sits on a higher, enterprise-level tier rather than the entry plans, and per-minute pricing that runs higher than some rivals.</w:t>
+      </w:r>
+    </w:p>
+    <w:p>
+      <w:pPr>
+        <w:spacing w:after="110" w:line="278"/>
+      </w:pPr>
+      <w:r>
+        <w:rPr>
+          <w:rFonts w:ascii="Calibri" w:cs="Calibri" w:eastAsia="Calibri" w:hAnsi="Calibri"/>
+          <w:b/>
+          <w:bCs/>
+          <w:i w:val="false"/>
+          <w:iCs w:val="false"/>
+          <w:color w:val="24303F"/>
+          <w:sz w:val="20"/>
+          <w:szCs w:val="20"/>
+        </w:rPr>
+        <w:t xml:space="preserve">Autocalls. </w:t>
+      </w:r>
+      <w:r>
+        <w:rPr>
+          <w:rFonts w:ascii="Calibri" w:cs="Calibri" w:eastAsia="Calibri" w:hAnsi="Calibri"/>
+          <w:b w:val="false"/>
+          <w:bCs w:val="false"/>
+          <w:i w:val="false"/>
+          <w:iCs w:val="false"/>
+          <w:color w:val="24303F"/>
+          <w:sz w:val="20"/>
+          <w:szCs w:val="20"/>
+        </w:rPr>
+        <w:t xml:space="preserve">The fast-launch, low-cost option. All-inclusive usage from around $0.09 a minute, a White-Label plan around $419 a month with unlimited sub-accounts, Stripe rebilling and full branding, plus voice, WhatsApp and chat and 300-plus integrations, with a pitched launch in about 24 hours. Best for agencies that want speed, low per-minute cost and multi-channel. Watch for compliance depth: it competes on price and speed rather than a deep certification and audit story, so check it against your regulated clients' needs.</w:t>
+      </w:r>
+    </w:p>
+    <w:p>
+      <w:pPr>
+        <w:spacing w:after="110" w:line="278"/>
+      </w:pPr>
+      <w:r>
+        <w:rPr>
+          <w:rFonts w:ascii="Calibri" w:cs="Calibri" w:eastAsia="Calibri" w:hAnsi="Calibri"/>
+          <w:b/>
+          <w:bCs/>
+          <w:i w:val="false"/>
+          <w:iCs w:val="false"/>
+          <w:color w:val="24303F"/>
+          <w:sz w:val="20"/>
+          <w:szCs w:val="20"/>
+        </w:rPr>
+        <w:t xml:space="preserve">VoiceAIWrapper. </w:t>
+      </w:r>
+      <w:r>
+        <w:rPr>
+          <w:rFonts w:ascii="Calibri" w:cs="Calibri" w:eastAsia="Calibri" w:hAnsi="Calibri"/>
+          <w:b w:val="false"/>
+          <w:bCs w:val="false"/>
+          <w:i w:val="false"/>
+          <w:iCs w:val="false"/>
+          <w:color w:val="24303F"/>
+          <w:sz w:val="20"/>
+          <w:szCs w:val="20"/>
+        </w:rPr>
+        <w:t xml:space="preserve">A wrapper platform: it puts a branded agency dashboard, billing and sub-accounts on top of providers like Vapi, Retell, ElevenLabs, Bolna and Ultravox, so you resell their engines as your own from around $29 a month. It holds SOC 2 Type 2, GDPR and HIPAA (with a BAA on the Pro tier). Best for agencies that want to launch fast over an existing provider without building the reseller layer themselves. Watch for the responsibility split: it states that contracts, billing and compliance obligations with your clients sit with you.</w:t>
+      </w:r>
+    </w:p>
+    <w:p>
+      <w:pPr>
+        <w:spacing w:after="110" w:line="278"/>
+      </w:pPr>
+      <w:r>
+        <w:rPr>
+          <w:rFonts w:ascii="Calibri" w:cs="Calibri" w:eastAsia="Calibri" w:hAnsi="Calibri"/>
+          <w:b/>
+          <w:bCs/>
+          <w:i w:val="false"/>
+          <w:iCs w:val="false"/>
+          <w:color w:val="24303F"/>
+          <w:sz w:val="20"/>
+          <w:szCs w:val="20"/>
+        </w:rPr>
+        <w:t xml:space="preserve">Stammer. </w:t>
+      </w:r>
+      <w:r>
+        <w:rPr>
+          <w:rFonts w:ascii="Calibri" w:cs="Calibri" w:eastAsia="Calibri" w:hAnsi="Calibri"/>
+          <w:b w:val="false"/>
+          <w:bCs w:val="false"/>
+          <w:i w:val="false"/>
+          <w:iCs w:val="false"/>
+          <w:color w:val="24303F"/>
+          <w:sz w:val="20"/>
+          <w:szCs w:val="20"/>
+        </w:rPr>
+        <w:t xml:space="preserve">A chat-first platform that added voice, letting agencies sell both under one brand, with an Agency plan around $197 a month and usage roughly $0.11 to $0.17 a minute depending on the model. Best for agencies leading with chatbots that want a voice option from the same vendor. Watch for compliance: it publishes GDPR only, with no HIPAA, which rules it out for healthcare and most regulated work.</w:t>
       </w:r>
     </w:p>
     <w:p>

</xml_diff>